<commit_message>
fix: data de assinatura exibindo um dia antes (bug de fuso em campos @db.Date)
</commit_message>
<xml_diff>
--- a/templates/Contrato de gestão __Nome _ Razão Social__.docx
+++ b/templates/Contrato de gestão __Nome _ Razão Social__.docx
@@ -123,14 +123,7 @@
           <w:sz w:val="21"/>
           <w:szCs w:val="21"/>
         </w:rPr>
-        <w:t>proﬁssion</w:t>
-      </w:r>
-      <w:r>
-        <w:rPr>
-          <w:sz w:val="21"/>
-          <w:szCs w:val="21"/>
-        </w:rPr>
-        <w:t>ais</w:t>
+        <w:t>proﬁssionais</w:t>
       </w:r>
       <w:proofErr w:type="spellEnd"/>
       <w:r>
@@ -188,14 +181,7 @@
           <w:sz w:val="21"/>
           <w:szCs w:val="21"/>
         </w:rPr>
-        <w:t>Como representante do cliente ven</w:t>
-      </w:r>
-      <w:r>
-        <w:rPr>
-          <w:sz w:val="21"/>
-          <w:szCs w:val="21"/>
-        </w:rPr>
-        <w:t xml:space="preserve">dedor, nossos corretores se comprometem a realizar um trabalho consistente que inclui um estudo de </w:t>
+        <w:t xml:space="preserve">Como representante do cliente vendedor, nossos corretores se comprometem a realizar um trabalho consistente que inclui um estudo de </w:t>
       </w:r>
       <w:proofErr w:type="spellStart"/>
       <w:r>
@@ -227,14 +213,7 @@
           <w:sz w:val="21"/>
           <w:szCs w:val="21"/>
         </w:rPr>
-        <w:t xml:space="preserve"> e divulgação em mídias adequadas), reuniões</w:t>
-      </w:r>
-      <w:r>
-        <w:rPr>
-          <w:sz w:val="21"/>
-          <w:szCs w:val="21"/>
-        </w:rPr>
-        <w:t xml:space="preserve"> de feedback e acompanhamento de documentação.</w:t>
+        <w:t xml:space="preserve"> e divulgação em mídias adequadas), reuniões de feedback e acompanhamento de documentação.</w:t>
       </w:r>
     </w:p>
     <w:p>
@@ -301,14 +280,7 @@
           <w:sz w:val="21"/>
           <w:szCs w:val="21"/>
         </w:rPr>
-        <w:t xml:space="preserve"> que ele será o único corretor apto a vendê-lo. Ao escolher um representante da RE/MAX, seu imóvel será divulgado profissionalmente num cadastro acessado por milhares de corretores da RE/MAX no Brasil, além de corretores e</w:t>
-      </w:r>
-      <w:r>
-        <w:rPr>
-          <w:sz w:val="21"/>
-          <w:szCs w:val="21"/>
-        </w:rPr>
-        <w:t xml:space="preserve"> imobiliárias parceiras. Toda a mediação e agendamento de visitas, contudo, será realizada por seu representante a quem caberá a responsabilidade de todo o processo de venda.</w:t>
+        <w:t xml:space="preserve"> que ele será o único corretor apto a vendê-lo. Ao escolher um representante da RE/MAX, seu imóvel será divulgado profissionalmente num cadastro acessado por milhares de corretores da RE/MAX no Brasil, além de corretores e imobiliárias parceiras. Toda a mediação e agendamento de visitas, contudo, será realizada por seu representante a quem caberá a responsabilidade de todo o processo de venda.</w:t>
       </w:r>
     </w:p>
     <w:p>
@@ -351,294 +323,6 @@
         </w:rPr>
         <w:t>imóvel no valor adequado e no menor tempo possível.</w:t>
       </w:r>
-      <w:r>
-        <w:rPr>
-          <w:noProof/>
-        </w:rPr>
-        <w:drawing>
-          <wp:anchor distT="114300" distB="114300" distL="114300" distR="114300" simplePos="0" relativeHeight="251658240" behindDoc="0" locked="0" layoutInCell="1" hidden="0" allowOverlap="1">
-            <wp:simplePos x="0" y="0"/>
-            <wp:positionH relativeFrom="column">
-              <wp:posOffset>1400175</wp:posOffset>
-            </wp:positionH>
-            <wp:positionV relativeFrom="paragraph">
-              <wp:posOffset>419100</wp:posOffset>
-            </wp:positionV>
-            <wp:extent cx="551065" cy="819150"/>
-            <wp:effectExtent l="0" t="0" r="0" b="0"/>
-            <wp:wrapNone/>
-            <wp:docPr id="5" name="image1.png"/>
-            <wp:cNvGraphicFramePr/>
-            <a:graphic xmlns:a="http://schemas.openxmlformats.org/drawingml/2006/main">
-              <a:graphicData uri="http://schemas.openxmlformats.org/drawingml/2006/picture">
-                <pic:pic xmlns:pic="http://schemas.openxmlformats.org/drawingml/2006/picture">
-                  <pic:nvPicPr>
-                    <pic:cNvPr id="0" name="image1.png"/>
-                    <pic:cNvPicPr preferRelativeResize="0"/>
-                  </pic:nvPicPr>
-                  <pic:blipFill>
-                    <a:blip r:embed="rId12"/>
-                    <a:srcRect/>
-                    <a:stretch>
-                      <a:fillRect/>
-                    </a:stretch>
-                  </pic:blipFill>
-                  <pic:spPr>
-                    <a:xfrm>
-                      <a:off x="0" y="0"/>
-                      <a:ext cx="551065" cy="819150"/>
-                    </a:xfrm>
-                    <a:prstGeom prst="rect">
-                      <a:avLst/>
-                    </a:prstGeom>
-                    <a:ln/>
-                  </pic:spPr>
-                </pic:pic>
-              </a:graphicData>
-            </a:graphic>
-          </wp:anchor>
-        </w:drawing>
-      </w:r>
-      <w:r>
-        <w:rPr>
-          <w:noProof/>
-        </w:rPr>
-        <w:drawing>
-          <wp:anchor distT="114300" distB="114300" distL="114300" distR="114300" simplePos="0" relativeHeight="251659264" behindDoc="0" locked="0" layoutInCell="1" hidden="0" allowOverlap="1">
-            <wp:simplePos x="0" y="0"/>
-            <wp:positionH relativeFrom="column">
-              <wp:posOffset>2971800</wp:posOffset>
-            </wp:positionH>
-            <wp:positionV relativeFrom="paragraph">
-              <wp:posOffset>434455</wp:posOffset>
-            </wp:positionV>
-            <wp:extent cx="1647825" cy="628650"/>
-            <wp:effectExtent l="0" t="0" r="0" b="0"/>
-            <wp:wrapNone/>
-            <wp:docPr id="9" name="image6.png"/>
-            <wp:cNvGraphicFramePr/>
-            <a:graphic xmlns:a="http://schemas.openxmlformats.org/drawingml/2006/main">
-              <a:graphicData uri="http://schemas.openxmlformats.org/drawingml/2006/picture">
-                <pic:pic xmlns:pic="http://schemas.openxmlformats.org/drawingml/2006/picture">
-                  <pic:nvPicPr>
-                    <pic:cNvPr id="0" name="image6.png"/>
-                    <pic:cNvPicPr preferRelativeResize="0"/>
-                  </pic:nvPicPr>
-                  <pic:blipFill>
-                    <a:blip r:embed="rId13"/>
-                    <a:srcRect/>
-                    <a:stretch>
-                      <a:fillRect/>
-                    </a:stretch>
-                  </pic:blipFill>
-                  <pic:spPr>
-                    <a:xfrm>
-                      <a:off x="0" y="0"/>
-                      <a:ext cx="1647825" cy="628650"/>
-                    </a:xfrm>
-                    <a:prstGeom prst="rect">
-                      <a:avLst/>
-                    </a:prstGeom>
-                    <a:ln/>
-                  </pic:spPr>
-                </pic:pic>
-              </a:graphicData>
-            </a:graphic>
-          </wp:anchor>
-        </w:drawing>
-      </w:r>
-      <w:r>
-        <w:rPr>
-          <w:noProof/>
-        </w:rPr>
-        <w:drawing>
-          <wp:anchor distT="114300" distB="114300" distL="114300" distR="114300" simplePos="0" relativeHeight="251660288" behindDoc="0" locked="0" layoutInCell="1" hidden="0" allowOverlap="1">
-            <wp:simplePos x="0" y="0"/>
-            <wp:positionH relativeFrom="column">
-              <wp:posOffset>-342899</wp:posOffset>
-            </wp:positionH>
-            <wp:positionV relativeFrom="paragraph">
-              <wp:posOffset>423863</wp:posOffset>
-            </wp:positionV>
-            <wp:extent cx="490538" cy="820899"/>
-            <wp:effectExtent l="0" t="0" r="0" b="0"/>
-            <wp:wrapNone/>
-            <wp:docPr id="4" name="image7.png"/>
-            <wp:cNvGraphicFramePr/>
-            <a:graphic xmlns:a="http://schemas.openxmlformats.org/drawingml/2006/main">
-              <a:graphicData uri="http://schemas.openxmlformats.org/drawingml/2006/picture">
-                <pic:pic xmlns:pic="http://schemas.openxmlformats.org/drawingml/2006/picture">
-                  <pic:nvPicPr>
-                    <pic:cNvPr id="0" name="image7.png"/>
-                    <pic:cNvPicPr preferRelativeResize="0"/>
-                  </pic:nvPicPr>
-                  <pic:blipFill>
-                    <a:blip r:embed="rId14"/>
-                    <a:srcRect/>
-                    <a:stretch>
-                      <a:fillRect/>
-                    </a:stretch>
-                  </pic:blipFill>
-                  <pic:spPr>
-                    <a:xfrm>
-                      <a:off x="0" y="0"/>
-                      <a:ext cx="490538" cy="820899"/>
-                    </a:xfrm>
-                    <a:prstGeom prst="rect">
-                      <a:avLst/>
-                    </a:prstGeom>
-                    <a:ln/>
-                  </pic:spPr>
-                </pic:pic>
-              </a:graphicData>
-            </a:graphic>
-          </wp:anchor>
-        </w:drawing>
-      </w:r>
-      <w:r>
-        <w:rPr>
-          <w:noProof/>
-        </w:rPr>
-        <w:drawing>
-          <wp:anchor distT="114300" distB="114300" distL="114300" distR="114300" simplePos="0" relativeHeight="251661312" behindDoc="0" locked="0" layoutInCell="1" hidden="0" allowOverlap="1">
-            <wp:simplePos x="0" y="0"/>
-            <wp:positionH relativeFrom="column">
-              <wp:posOffset>809625</wp:posOffset>
-            </wp:positionH>
-            <wp:positionV relativeFrom="paragraph">
-              <wp:posOffset>404813</wp:posOffset>
-            </wp:positionV>
-            <wp:extent cx="495300" cy="844924"/>
-            <wp:effectExtent l="0" t="0" r="0" b="0"/>
-            <wp:wrapNone/>
-            <wp:docPr id="2" name="image4.png"/>
-            <wp:cNvGraphicFramePr/>
-            <a:graphic xmlns:a="http://schemas.openxmlformats.org/drawingml/2006/main">
-              <a:graphicData uri="http://schemas.openxmlformats.org/drawingml/2006/picture">
-                <pic:pic xmlns:pic="http://schemas.openxmlformats.org/drawingml/2006/picture">
-                  <pic:nvPicPr>
-                    <pic:cNvPr id="0" name="image4.png"/>
-                    <pic:cNvPicPr preferRelativeResize="0"/>
-                  </pic:nvPicPr>
-                  <pic:blipFill>
-                    <a:blip r:embed="rId15"/>
-                    <a:srcRect/>
-                    <a:stretch>
-                      <a:fillRect/>
-                    </a:stretch>
-                  </pic:blipFill>
-                  <pic:spPr>
-                    <a:xfrm>
-                      <a:off x="0" y="0"/>
-                      <a:ext cx="495300" cy="844924"/>
-                    </a:xfrm>
-                    <a:prstGeom prst="rect">
-                      <a:avLst/>
-                    </a:prstGeom>
-                    <a:ln/>
-                  </pic:spPr>
-                </pic:pic>
-              </a:graphicData>
-            </a:graphic>
-          </wp:anchor>
-        </w:drawing>
-      </w:r>
-      <w:r>
-        <w:rPr>
-          <w:noProof/>
-        </w:rPr>
-        <w:drawing>
-          <wp:anchor distT="114300" distB="114300" distL="114300" distR="114300" simplePos="0" relativeHeight="251662336" behindDoc="0" locked="0" layoutInCell="1" hidden="0" allowOverlap="1">
-            <wp:simplePos x="0" y="0"/>
-            <wp:positionH relativeFrom="column">
-              <wp:posOffset>247650</wp:posOffset>
-            </wp:positionH>
-            <wp:positionV relativeFrom="paragraph">
-              <wp:posOffset>390525</wp:posOffset>
-            </wp:positionV>
-            <wp:extent cx="464976" cy="876300"/>
-            <wp:effectExtent l="0" t="0" r="0" b="0"/>
-            <wp:wrapNone/>
-            <wp:docPr id="3" name="image3.png"/>
-            <wp:cNvGraphicFramePr/>
-            <a:graphic xmlns:a="http://schemas.openxmlformats.org/drawingml/2006/main">
-              <a:graphicData uri="http://schemas.openxmlformats.org/drawingml/2006/picture">
-                <pic:pic xmlns:pic="http://schemas.openxmlformats.org/drawingml/2006/picture">
-                  <pic:nvPicPr>
-                    <pic:cNvPr id="0" name="image3.png"/>
-                    <pic:cNvPicPr preferRelativeResize="0"/>
-                  </pic:nvPicPr>
-                  <pic:blipFill>
-                    <a:blip r:embed="rId16"/>
-                    <a:srcRect/>
-                    <a:stretch>
-                      <a:fillRect/>
-                    </a:stretch>
-                  </pic:blipFill>
-                  <pic:spPr>
-                    <a:xfrm>
-                      <a:off x="0" y="0"/>
-                      <a:ext cx="464976" cy="876300"/>
-                    </a:xfrm>
-                    <a:prstGeom prst="rect">
-                      <a:avLst/>
-                    </a:prstGeom>
-                    <a:ln/>
-                  </pic:spPr>
-                </pic:pic>
-              </a:graphicData>
-            </a:graphic>
-          </wp:anchor>
-        </w:drawing>
-      </w:r>
-      <w:r>
-        <w:rPr>
-          <w:noProof/>
-        </w:rPr>
-        <w:drawing>
-          <wp:anchor distT="114300" distB="114300" distL="114300" distR="114300" simplePos="0" relativeHeight="251663360" behindDoc="0" locked="0" layoutInCell="1" hidden="0" allowOverlap="1">
-            <wp:simplePos x="0" y="0"/>
-            <wp:positionH relativeFrom="column">
-              <wp:posOffset>2138363</wp:posOffset>
-            </wp:positionH>
-            <wp:positionV relativeFrom="paragraph">
-              <wp:posOffset>418972</wp:posOffset>
-            </wp:positionV>
-            <wp:extent cx="647700" cy="676275"/>
-            <wp:effectExtent l="0" t="0" r="0" b="0"/>
-            <wp:wrapNone/>
-            <wp:docPr id="7" name="image5.png"/>
-            <wp:cNvGraphicFramePr/>
-            <a:graphic xmlns:a="http://schemas.openxmlformats.org/drawingml/2006/main">
-              <a:graphicData uri="http://schemas.openxmlformats.org/drawingml/2006/picture">
-                <pic:pic xmlns:pic="http://schemas.openxmlformats.org/drawingml/2006/picture">
-                  <pic:nvPicPr>
-                    <pic:cNvPr id="0" name="image5.png"/>
-                    <pic:cNvPicPr preferRelativeResize="0"/>
-                  </pic:nvPicPr>
-                  <pic:blipFill>
-                    <a:blip r:embed="rId17"/>
-                    <a:srcRect/>
-                    <a:stretch>
-                      <a:fillRect/>
-                    </a:stretch>
-                  </pic:blipFill>
-                  <pic:spPr>
-                    <a:xfrm>
-                      <a:off x="0" y="0"/>
-                      <a:ext cx="647700" cy="676275"/>
-                    </a:xfrm>
-                    <a:prstGeom prst="rect">
-                      <a:avLst/>
-                    </a:prstGeom>
-                    <a:ln/>
-                  </pic:spPr>
-                </pic:pic>
-              </a:graphicData>
-            </a:graphic>
-          </wp:anchor>
-        </w:drawing>
-      </w:r>
     </w:p>
     <w:p>
       <w:pPr>
@@ -654,14 +338,7 @@
           <w:sz w:val="21"/>
           <w:szCs w:val="21"/>
         </w:rPr>
-        <w:t>Do outro, garante que todo investimento feito por esse corretor não</w:t>
-      </w:r>
-      <w:r>
-        <w:rPr>
-          <w:sz w:val="21"/>
-          <w:szCs w:val="21"/>
-        </w:rPr>
-        <w:t xml:space="preserve"> será em vão, fazendo com que ele tenha assegurada sua contrapartida pelos serviços prestados.</w:t>
+        <w:t>Do outro, garante que todo investimento feito por esse corretor não será em vão, fazendo com que ele tenha assegurada sua contrapartida pelos serviços prestados.</w:t>
       </w:r>
     </w:p>
     <w:p>
@@ -694,8 +371,175 @@
           <w:sz w:val="21"/>
           <w:szCs w:val="21"/>
         </w:rPr>
-        <w:t xml:space="preserve"> da RE/MAX somente trabalham com um número limitado de imóveis</w:t>
-      </w:r>
+        <w:t xml:space="preserve"> da RE/MAX somente trabalham com um número limitado de imóveis.</w:t>
+      </w:r>
+    </w:p>
+    <w:p>
+      <w:pPr>
+        <w:ind w:left="-270" w:right="-270"/>
+        <w:jc w:val="both"/>
+        <w:rPr>
+          <w:sz w:val="21"/>
+          <w:szCs w:val="21"/>
+        </w:rPr>
+      </w:pPr>
+      <w:proofErr w:type="spellStart"/>
+      <w:r>
+        <w:rPr>
+          <w:sz w:val="21"/>
+          <w:szCs w:val="21"/>
+        </w:rPr>
+        <w:t>Aﬁnal</w:t>
+      </w:r>
+      <w:proofErr w:type="spellEnd"/>
+      <w:r>
+        <w:rPr>
+          <w:sz w:val="21"/>
+          <w:szCs w:val="21"/>
+        </w:rPr>
+        <w:t>, seja franco: como um corretor, sozinho e com mais de 20 imóveis na carteira, conseguirá se dedicar à gestão da venda de um imóvel?</w:t>
+      </w:r>
+    </w:p>
+    <w:p>
+      <w:pPr>
+        <w:ind w:left="-270" w:right="-270"/>
+        <w:jc w:val="both"/>
+        <w:rPr>
+          <w:sz w:val="21"/>
+          <w:szCs w:val="21"/>
+        </w:rPr>
+      </w:pPr>
+      <w:r>
+        <w:rPr>
+          <w:sz w:val="21"/>
+          <w:szCs w:val="21"/>
+        </w:rPr>
+        <w:t xml:space="preserve">O conceito de representação é uma prática comum de mercado na maioria dos países de economia desenvolvida onde as pessoas estão acostumadas a buscar um </w:t>
+      </w:r>
+      <w:proofErr w:type="spellStart"/>
+      <w:r>
+        <w:rPr>
+          <w:sz w:val="21"/>
+          <w:szCs w:val="21"/>
+        </w:rPr>
+        <w:t>proﬁssional</w:t>
+      </w:r>
+      <w:proofErr w:type="spellEnd"/>
+      <w:r>
+        <w:rPr>
+          <w:sz w:val="21"/>
+          <w:szCs w:val="21"/>
+        </w:rPr>
+        <w:t xml:space="preserve"> gabaritado para representá-las. A ideia é simples: assim como um advogado representa os interesses de uma das partes durante um processo, o vendedor de um imóvel escolhe um corretor representante para defender seus interesses durante a venda.</w:t>
+      </w:r>
+    </w:p>
+    <w:p>
+      <w:pPr>
+        <w:ind w:left="-270" w:right="-270"/>
+        <w:jc w:val="both"/>
+        <w:rPr>
+          <w:sz w:val="21"/>
+          <w:szCs w:val="21"/>
+        </w:rPr>
+      </w:pPr>
+      <w:r>
+        <w:rPr>
+          <w:sz w:val="21"/>
+          <w:szCs w:val="21"/>
+        </w:rPr>
+        <w:t xml:space="preserve">E o melhor: em vez de o cliente ter que lidar com dezenas de potenciais intermediários (incluindo especuladores), o representante atua como um importante mediador que </w:t>
+      </w:r>
+      <w:proofErr w:type="spellStart"/>
+      <w:r>
+        <w:rPr>
+          <w:sz w:val="21"/>
+          <w:szCs w:val="21"/>
+        </w:rPr>
+        <w:t>uniﬁca</w:t>
+      </w:r>
+      <w:proofErr w:type="spellEnd"/>
+      <w:r>
+        <w:rPr>
+          <w:sz w:val="21"/>
+          <w:szCs w:val="21"/>
+        </w:rPr>
+        <w:t xml:space="preserve"> a mensagem de venda e gera mais valor ao imóvel.</w:t>
+      </w:r>
+    </w:p>
+    <w:p>
+      <w:pPr>
+        <w:ind w:left="-270" w:right="-270"/>
+        <w:jc w:val="both"/>
+        <w:rPr>
+          <w:sz w:val="21"/>
+          <w:szCs w:val="21"/>
+        </w:rPr>
+      </w:pPr>
+      <w:r>
+        <w:rPr>
+          <w:sz w:val="21"/>
+          <w:szCs w:val="21"/>
+        </w:rPr>
+        <w:t xml:space="preserve">Para que todos ganhem, claro, </w:t>
+      </w:r>
+      <w:proofErr w:type="gramStart"/>
+      <w:r>
+        <w:rPr>
+          <w:sz w:val="21"/>
+          <w:szCs w:val="21"/>
+        </w:rPr>
+        <w:t>cada um precisa</w:t>
+      </w:r>
+      <w:proofErr w:type="gramEnd"/>
+      <w:r>
+        <w:rPr>
+          <w:sz w:val="21"/>
+          <w:szCs w:val="21"/>
+        </w:rPr>
+        <w:t xml:space="preserve"> fazer sua parte.</w:t>
+      </w:r>
+    </w:p>
+    <w:p>
+      <w:pPr>
+        <w:ind w:left="-270" w:right="-270"/>
+        <w:jc w:val="both"/>
+        <w:rPr>
+          <w:sz w:val="21"/>
+          <w:szCs w:val="21"/>
+        </w:rPr>
+      </w:pPr>
+      <w:r>
+        <w:rPr>
+          <w:sz w:val="21"/>
+          <w:szCs w:val="21"/>
+        </w:rPr>
+        <w:t xml:space="preserve">Isso requer uma relação de </w:t>
+      </w:r>
+      <w:proofErr w:type="spellStart"/>
+      <w:r>
+        <w:rPr>
+          <w:sz w:val="21"/>
+          <w:szCs w:val="21"/>
+        </w:rPr>
+        <w:t>conﬁança</w:t>
+      </w:r>
+      <w:proofErr w:type="spellEnd"/>
+      <w:r>
+        <w:rPr>
+          <w:sz w:val="21"/>
+          <w:szCs w:val="21"/>
+        </w:rPr>
+        <w:t xml:space="preserve"> e parceria com seu representante que inclui disponibilidade de agenda, reuniões periódicas e uma adequada preparação do imóvel para visitas e cobertura </w:t>
+      </w:r>
+      <w:proofErr w:type="spellStart"/>
+      <w:r>
+        <w:rPr>
+          <w:sz w:val="21"/>
+          <w:szCs w:val="21"/>
+        </w:rPr>
+        <w:t>fotográﬁca</w:t>
+      </w:r>
+      <w:proofErr w:type="spellEnd"/>
       <w:r>
         <w:rPr>
           <w:sz w:val="21"/>
@@ -713,214 +557,12 @@
           <w:szCs w:val="21"/>
         </w:rPr>
       </w:pPr>
-      <w:proofErr w:type="spellStart"/>
-      <w:r>
-        <w:rPr>
-          <w:sz w:val="21"/>
-          <w:szCs w:val="21"/>
-        </w:rPr>
-        <w:t>Aﬁnal</w:t>
-      </w:r>
-      <w:proofErr w:type="spellEnd"/>
-      <w:r>
-        <w:rPr>
-          <w:sz w:val="21"/>
-          <w:szCs w:val="21"/>
-        </w:rPr>
-        <w:t>, seja franco: como um corretor, sozinho e com mais de 20 imóveis na carteira, conseguirá se dedicar à gestão da venda de um imóvel?</w:t>
-      </w:r>
-    </w:p>
-    <w:p>
-      <w:pPr>
-        <w:ind w:left="-270" w:right="-270"/>
-        <w:jc w:val="both"/>
-        <w:rPr>
-          <w:sz w:val="21"/>
-          <w:szCs w:val="21"/>
-        </w:rPr>
-      </w:pPr>
-      <w:r>
-        <w:rPr>
-          <w:sz w:val="21"/>
-          <w:szCs w:val="21"/>
-        </w:rPr>
-        <w:t xml:space="preserve">O conceito de representação é uma prática comum de mercado na maioria dos países de economia desenvolvida onde as pessoas estão acostumadas a buscar um </w:t>
-      </w:r>
-      <w:proofErr w:type="spellStart"/>
-      <w:r>
-        <w:rPr>
-          <w:sz w:val="21"/>
-          <w:szCs w:val="21"/>
-        </w:rPr>
-        <w:t>proﬁssional</w:t>
-      </w:r>
-      <w:proofErr w:type="spellEnd"/>
-      <w:r>
-        <w:rPr>
-          <w:sz w:val="21"/>
-          <w:szCs w:val="21"/>
-        </w:rPr>
-        <w:t xml:space="preserve"> gabaritado para representá-las. A ideia é simples: assim como um advogado representa os inte</w:t>
-      </w:r>
-      <w:r>
-        <w:rPr>
-          <w:sz w:val="21"/>
-          <w:szCs w:val="21"/>
-        </w:rPr>
-        <w:t>resses de uma das partes durante um processo, o vendedor de um imóvel escolhe um corretor representante para defender seus interesses durante a venda.</w:t>
-      </w:r>
-    </w:p>
-    <w:p>
-      <w:pPr>
-        <w:ind w:left="-270" w:right="-270"/>
-        <w:jc w:val="both"/>
-        <w:rPr>
-          <w:sz w:val="21"/>
-          <w:szCs w:val="21"/>
-        </w:rPr>
-      </w:pPr>
-      <w:r>
-        <w:rPr>
-          <w:sz w:val="21"/>
-          <w:szCs w:val="21"/>
-        </w:rPr>
-        <w:t>E o melhor: em vez de o cliente ter que lidar com dezenas de potenciais intermediários (incluindo especul</w:t>
-      </w:r>
-      <w:r>
-        <w:rPr>
-          <w:sz w:val="21"/>
-          <w:szCs w:val="21"/>
-        </w:rPr>
-        <w:t xml:space="preserve">adores), o representante atua como um importante mediador que </w:t>
-      </w:r>
-      <w:proofErr w:type="spellStart"/>
-      <w:r>
-        <w:rPr>
-          <w:sz w:val="21"/>
-          <w:szCs w:val="21"/>
-        </w:rPr>
-        <w:t>uniﬁca</w:t>
-      </w:r>
-      <w:proofErr w:type="spellEnd"/>
-      <w:r>
-        <w:rPr>
-          <w:sz w:val="21"/>
-          <w:szCs w:val="21"/>
-        </w:rPr>
-        <w:t xml:space="preserve"> a mensagem de venda e gera mais valor ao imóvel.</w:t>
-      </w:r>
-    </w:p>
-    <w:p>
-      <w:pPr>
-        <w:ind w:left="-270" w:right="-270"/>
-        <w:jc w:val="both"/>
-        <w:rPr>
-          <w:sz w:val="21"/>
-          <w:szCs w:val="21"/>
-        </w:rPr>
-      </w:pPr>
-      <w:r>
-        <w:rPr>
-          <w:sz w:val="21"/>
-          <w:szCs w:val="21"/>
-        </w:rPr>
-        <w:t xml:space="preserve">Para que todos ganhem, claro, </w:t>
-      </w:r>
-      <w:proofErr w:type="gramStart"/>
-      <w:r>
-        <w:rPr>
-          <w:sz w:val="21"/>
-          <w:szCs w:val="21"/>
-        </w:rPr>
-        <w:t>cada um precisa</w:t>
-      </w:r>
-      <w:proofErr w:type="gramEnd"/>
-      <w:r>
-        <w:rPr>
-          <w:sz w:val="21"/>
-          <w:szCs w:val="21"/>
-        </w:rPr>
-        <w:t xml:space="preserve"> fazer sua parte.</w:t>
-      </w:r>
-    </w:p>
-    <w:p>
-      <w:pPr>
-        <w:ind w:left="-270" w:right="-270"/>
-        <w:jc w:val="both"/>
-        <w:rPr>
-          <w:sz w:val="21"/>
-          <w:szCs w:val="21"/>
-        </w:rPr>
-      </w:pPr>
-      <w:r>
-        <w:rPr>
-          <w:sz w:val="21"/>
-          <w:szCs w:val="21"/>
-        </w:rPr>
-        <w:t xml:space="preserve">Isso requer uma relação de </w:t>
-      </w:r>
-      <w:proofErr w:type="spellStart"/>
-      <w:r>
-        <w:rPr>
-          <w:sz w:val="21"/>
-          <w:szCs w:val="21"/>
-        </w:rPr>
-        <w:t>conﬁança</w:t>
-      </w:r>
-      <w:proofErr w:type="spellEnd"/>
-      <w:r>
-        <w:rPr>
-          <w:sz w:val="21"/>
-          <w:szCs w:val="21"/>
-        </w:rPr>
-        <w:t xml:space="preserve"> e parceria com seu representante que in</w:t>
-      </w:r>
-      <w:r>
-        <w:rPr>
-          <w:sz w:val="21"/>
-          <w:szCs w:val="21"/>
-        </w:rPr>
-        <w:t xml:space="preserve">clui disponibilidade de agenda, reuniões periódicas e uma adequada preparação do imóvel para visitas e cobertura </w:t>
-      </w:r>
-      <w:proofErr w:type="spellStart"/>
-      <w:r>
-        <w:rPr>
-          <w:sz w:val="21"/>
-          <w:szCs w:val="21"/>
-        </w:rPr>
-        <w:t>fotográﬁca</w:t>
-      </w:r>
-      <w:proofErr w:type="spellEnd"/>
-      <w:r>
-        <w:rPr>
-          <w:sz w:val="21"/>
-          <w:szCs w:val="21"/>
-        </w:rPr>
-        <w:t>.</w:t>
-      </w:r>
-    </w:p>
-    <w:p>
-      <w:pPr>
-        <w:ind w:left="-270" w:right="-270"/>
-        <w:jc w:val="both"/>
-        <w:rPr>
-          <w:sz w:val="21"/>
-          <w:szCs w:val="21"/>
-        </w:rPr>
-      </w:pPr>
-      <w:r>
-        <w:rPr>
-          <w:sz w:val="21"/>
-          <w:szCs w:val="21"/>
-        </w:rPr>
-        <w:t>Após ler com atenção e assinar o contrato de representação, você descobrirá que está assumindo o melhor compromisso para vender seu</w:t>
-      </w:r>
-      <w:r>
-        <w:rPr>
-          <w:sz w:val="21"/>
-          <w:szCs w:val="21"/>
-        </w:rPr>
-        <w:t xml:space="preserve"> imóvel da forma mais ágil e </w:t>
+      <w:r>
+        <w:rPr>
+          <w:sz w:val="21"/>
+          <w:szCs w:val="21"/>
+        </w:rPr>
+        <w:t xml:space="preserve">Após ler com atenção e assinar o contrato de representação, você descobrirá que está assumindo o melhor compromisso para vender seu imóvel da forma mais ágil e </w:t>
       </w:r>
       <w:proofErr w:type="spellStart"/>
       <w:r>
@@ -990,7 +632,7 @@
                     <pic:cNvPicPr preferRelativeResize="0"/>
                   </pic:nvPicPr>
                   <pic:blipFill>
-                    <a:blip r:embed="rId18"/>
+                    <a:blip r:embed="rId12"/>
                     <a:srcRect/>
                     <a:stretch>
                       <a:fillRect/>
@@ -1026,19 +668,37 @@
     </w:p>
     <w:p>
       <w:pPr>
-        <w:spacing w:line="360" w:lineRule="auto"/>
-        <w:ind w:left="-566" w:right="-607"/>
-        <w:jc w:val="both"/>
-        <w:rPr>
-          <w:sz w:val="24"/>
-          <w:szCs w:val="24"/>
-        </w:rPr>
-      </w:pPr>
-      <w:r>
-        <w:rPr>
-          <w:sz w:val="24"/>
-          <w:szCs w:val="24"/>
-        </w:rPr>
+        <w:rPr>
+          <w:sz w:val="24"/>
+          <w:szCs w:val="24"/>
+        </w:rPr>
+      </w:pPr>
+      <w:r>
+        <w:rPr>
+          <w:sz w:val="24"/>
+          <w:szCs w:val="24"/>
+        </w:rPr>
+        <w:br w:type="page"/>
+      </w:r>
+    </w:p>
+    <w:p>
+      <w:pPr>
+        <w:spacing w:line="360" w:lineRule="auto"/>
+        <w:ind w:left="-566" w:right="-607"/>
+        <w:jc w:val="both"/>
+        <w:rPr>
+          <w:sz w:val="24"/>
+          <w:szCs w:val="24"/>
+        </w:rPr>
+      </w:pPr>
+      <w:bookmarkStart w:id="0" w:name="_GoBack"/>
+      <w:bookmarkEnd w:id="0"/>
+      <w:r>
+        <w:rPr>
+          <w:sz w:val="24"/>
+          <w:szCs w:val="24"/>
+        </w:rPr>
+        <w:lastRenderedPageBreak/>
         <w:t xml:space="preserve">Por este instrumento, de um lado </w:t>
       </w:r>
       <w:r>
@@ -1048,7 +708,14 @@
           <w:sz w:val="24"/>
           <w:szCs w:val="24"/>
         </w:rPr>
-        <w:t>Imobiliária Remax Eng</w:t>
+        <w:t>Imobiliária Remax Engimob</w:t>
+      </w:r>
+      <w:r>
+        <w:rPr>
+          <w:sz w:val="24"/>
+          <w:szCs w:val="24"/>
+        </w:rPr>
+        <w:t xml:space="preserve">, pessoa jurídica de direito privado, inscrita no </w:t>
       </w:r>
       <w:r>
         <w:rPr>
@@ -1057,14 +724,14 @@
           <w:sz w:val="24"/>
           <w:szCs w:val="24"/>
         </w:rPr>
-        <w:t>imob</w:t>
-      </w:r>
-      <w:r>
-        <w:rPr>
-          <w:sz w:val="24"/>
-          <w:szCs w:val="24"/>
-        </w:rPr>
-        <w:t xml:space="preserve">, pessoa jurídica de direito privado, inscrita no </w:t>
+        <w:t>CNPJ nº 30.902.268/0001-80</w:t>
+      </w:r>
+      <w:r>
+        <w:rPr>
+          <w:sz w:val="24"/>
+          <w:szCs w:val="24"/>
+        </w:rPr>
+        <w:t xml:space="preserve">, com sede a Rua Décima Avenida, 4517, Bairro Rio Madeira, na cidade de Porto Velho, Rondônia como doravante denominada </w:t>
       </w:r>
       <w:r>
         <w:rPr>
@@ -1073,22 +740,14 @@
           <w:sz w:val="24"/>
           <w:szCs w:val="24"/>
         </w:rPr>
-        <w:t>CNPJ nº 30.902.268/0001-80</w:t>
-      </w:r>
-      <w:r>
-        <w:rPr>
-          <w:sz w:val="24"/>
-          <w:szCs w:val="24"/>
-        </w:rPr>
-        <w:t xml:space="preserve">, com sede a Rua Décima Avenida, 4517, Bairro </w:t>
-      </w:r>
-      <w:r>
-        <w:rPr>
-          <w:sz w:val="24"/>
-          <w:szCs w:val="24"/>
-        </w:rPr>
-        <w:lastRenderedPageBreak/>
-        <w:t xml:space="preserve">Rio Madeira, na cidade de Porto Velho, Rondônia como doravante denominada </w:t>
+        <w:t>CONTRATADA</w:t>
+      </w:r>
+      <w:r>
+        <w:rPr>
+          <w:sz w:val="24"/>
+          <w:szCs w:val="24"/>
+        </w:rPr>
+        <w:t xml:space="preserve">; e de outro lado, doravante denominado (s) </w:t>
       </w:r>
       <w:r>
         <w:rPr>
@@ -1097,32 +756,7 @@
           <w:sz w:val="24"/>
           <w:szCs w:val="24"/>
         </w:rPr>
-        <w:t>CONTRATADA</w:t>
-      </w:r>
-      <w:r>
-        <w:rPr>
-          <w:sz w:val="24"/>
-          <w:szCs w:val="24"/>
-        </w:rPr>
-        <w:t xml:space="preserve">; e de outro lado, doravante denominado (s) </w:t>
-      </w:r>
-      <w:r>
-        <w:rPr>
-          <w:b/>
-          <w:bCs/>
-          <w:sz w:val="24"/>
-          <w:szCs w:val="24"/>
-        </w:rPr>
-        <w:t>CO</w:t>
-      </w:r>
-      <w:r>
-        <w:rPr>
-          <w:b/>
-          <w:bCs/>
-          <w:sz w:val="24"/>
-          <w:szCs w:val="24"/>
-        </w:rPr>
-        <w:t>NTRATANTE (S)</w:t>
+        <w:t>CONTRATANTE (S)</w:t>
       </w:r>
       <w:r>
         <w:rPr>
@@ -1726,8 +1360,6 @@
               </w:rPr>
               <w:t>Inscrição municipal: &lt;&lt;Inscricao&gt;&gt;</w:t>
             </w:r>
-            <w:bookmarkStart w:id="0" w:name="_GoBack"/>
-            <w:bookmarkEnd w:id="0"/>
           </w:p>
         </w:tc>
       </w:tr>
@@ -2405,7 +2037,16 @@
           <w:sz w:val="24"/>
           <w:szCs w:val="24"/>
         </w:rPr>
-        <w:t xml:space="preserve">Cláusula 1. O presente contrato tem por objeto a prestação de serviços de intermediação e representação imobiliária pela CONTRATADA ao(s) CONTRATANTE(S), nos termos dos artigos 722 e seguintes do código civil brasileiro, com relação ao </w:t>
+        <w:t xml:space="preserve">Cláusula 1. O presente contrato tem por objeto a prestação de serviços de intermediação e representação imobiliária pela CONTRATADA ao(s) CONTRATANTE(S), nos termos dos artigos </w:t>
+      </w:r>
+      <w:r>
+        <w:rPr>
+          <w:color w:val="221F1F"/>
+          <w:sz w:val="24"/>
+          <w:szCs w:val="24"/>
+        </w:rPr>
+        <w:lastRenderedPageBreak/>
+        <w:t xml:space="preserve">722 e seguintes do código civil brasileiro, com relação ao </w:t>
       </w:r>
       <w:proofErr w:type="spellStart"/>
       <w:r>
@@ -2423,34 +2064,25 @@
           <w:sz w:val="24"/>
           <w:szCs w:val="24"/>
         </w:rPr>
-        <w:t xml:space="preserve"> descrito no p</w:t>
-      </w:r>
+        <w:t xml:space="preserve"> descrito no presente instrumento. </w:t>
+      </w:r>
+    </w:p>
+    <w:p>
+      <w:pPr>
+        <w:spacing w:line="360" w:lineRule="auto"/>
+        <w:ind w:left="-566" w:right="-607"/>
+        <w:jc w:val="both"/>
+        <w:rPr>
+          <w:sz w:val="24"/>
+          <w:szCs w:val="24"/>
+        </w:rPr>
+      </w:pPr>
       <w:r>
         <w:rPr>
           <w:color w:val="221F1F"/>
           <w:sz w:val="24"/>
           <w:szCs w:val="24"/>
         </w:rPr>
-        <w:t xml:space="preserve">resente instrumento. </w:t>
-      </w:r>
-    </w:p>
-    <w:p>
-      <w:pPr>
-        <w:spacing w:line="360" w:lineRule="auto"/>
-        <w:ind w:left="-566" w:right="-607"/>
-        <w:jc w:val="both"/>
-        <w:rPr>
-          <w:sz w:val="24"/>
-          <w:szCs w:val="24"/>
-        </w:rPr>
-      </w:pPr>
-      <w:r>
-        <w:rPr>
-          <w:color w:val="221F1F"/>
-          <w:sz w:val="24"/>
-          <w:szCs w:val="24"/>
-        </w:rPr>
-        <w:lastRenderedPageBreak/>
         <w:t xml:space="preserve">Cláusula 1.1. </w:t>
       </w:r>
       <w:r>
@@ -2503,64 +2135,36 @@
           <w:sz w:val="24"/>
           <w:szCs w:val="24"/>
         </w:rPr>
-        <w:t>Cláus</w:t>
-      </w:r>
-      <w:r>
-        <w:rPr>
-          <w:sz w:val="24"/>
-          <w:szCs w:val="24"/>
-        </w:rPr>
-        <w:t>ula 1.2. Como contrapartida, o(s) CONTRATANTE(S) garantirão à CONTRATADA o exercício exclusivo da representação imobiliária relativamente ao imóvel, sendo portanto a CONTRATADA a única nomeada para intermediar e representar o(s) CONTRATANTE(S) perante o me</w:t>
-      </w:r>
-      <w:r>
-        <w:rPr>
-          <w:sz w:val="24"/>
-          <w:szCs w:val="24"/>
-        </w:rPr>
-        <w:t>rcado com relação ao imóvel pelo prazo de &lt;&lt;Prazo da gestão&gt;&gt; dias contados da data de assinatura do presente instrumento, renováveis por igual período, salvo manifestação contrária das Partes.</w:t>
-      </w:r>
-    </w:p>
-    <w:p>
-      <w:pPr>
-        <w:spacing w:line="360" w:lineRule="auto"/>
-        <w:ind w:left="-566" w:right="-607"/>
-        <w:jc w:val="both"/>
-        <w:rPr>
-          <w:sz w:val="24"/>
-          <w:szCs w:val="24"/>
-        </w:rPr>
-      </w:pPr>
-    </w:p>
-    <w:p>
-      <w:pPr>
-        <w:spacing w:line="360" w:lineRule="auto"/>
-        <w:ind w:left="-566" w:right="-607"/>
-        <w:jc w:val="both"/>
-        <w:rPr>
-          <w:sz w:val="24"/>
-          <w:szCs w:val="24"/>
-        </w:rPr>
-      </w:pPr>
-      <w:r>
-        <w:rPr>
-          <w:sz w:val="24"/>
-          <w:szCs w:val="24"/>
-        </w:rPr>
-        <w:t>Cláusula 1.3.  O(s) CONTRATANTE(S) reconhece que o prazo conc</w:t>
-      </w:r>
-      <w:r>
-        <w:rPr>
-          <w:sz w:val="24"/>
-          <w:szCs w:val="24"/>
-        </w:rPr>
-        <w:t>edido na cláusula 1.2 é essencial para o desenvolvimento dos serviços descritos na cláusula 2.1 e que a concessão deste prazo é condição essencial para a realização dos investimentos da CONTRATADA na divulgação e prospecção de oportunidades de negócio em f</w:t>
-      </w:r>
-      <w:r>
-        <w:rPr>
-          <w:sz w:val="24"/>
-          <w:szCs w:val="24"/>
-        </w:rPr>
-        <w:t>avor do(s) CONTRATANTE(S).</w:t>
+        <w:t>Cláusula 1.2. Como contrapartida, o(s) CONTRATANTE(S) garantirão à CONTRATADA o exercício exclusivo da representação imobiliária relativamente ao imóvel, sendo portanto a CONTRATADA a única nomeada para intermediar e representar o(s) CONTRATANTE(S) perante o mercado com relação ao imóvel pelo prazo de &lt;&lt;Prazo da gestão&gt;&gt; dias contados da data de assinatura do presente instrumento, renováveis por igual período, salvo manifestação contrária das Partes.</w:t>
+      </w:r>
+    </w:p>
+    <w:p>
+      <w:pPr>
+        <w:spacing w:line="360" w:lineRule="auto"/>
+        <w:ind w:left="-566" w:right="-607"/>
+        <w:jc w:val="both"/>
+        <w:rPr>
+          <w:sz w:val="24"/>
+          <w:szCs w:val="24"/>
+        </w:rPr>
+      </w:pPr>
+    </w:p>
+    <w:p>
+      <w:pPr>
+        <w:spacing w:line="360" w:lineRule="auto"/>
+        <w:ind w:left="-566" w:right="-607"/>
+        <w:jc w:val="both"/>
+        <w:rPr>
+          <w:sz w:val="24"/>
+          <w:szCs w:val="24"/>
+        </w:rPr>
+      </w:pPr>
+      <w:r>
+        <w:rPr>
+          <w:sz w:val="24"/>
+          <w:szCs w:val="24"/>
+        </w:rPr>
+        <w:t>Cláusula 1.3.  O(s) CONTRATANTE(S) reconhece que o prazo concedido na cláusula 1.2 é essencial para o desenvolvimento dos serviços descritos na cláusula 2.1 e que a concessão deste prazo é condição essencial para a realização dos investimentos da CONTRATADA na divulgação e prospecção de oportunidades de negócio em favor do(s) CONTRATANTE(S).</w:t>
       </w:r>
     </w:p>
     <w:p>
@@ -2735,14 +2339,7 @@
           <w:sz w:val="24"/>
           <w:szCs w:val="24"/>
         </w:rPr>
-        <w:t xml:space="preserve"> do i</w:t>
-      </w:r>
-      <w:r>
-        <w:rPr>
-          <w:sz w:val="24"/>
-          <w:szCs w:val="24"/>
-        </w:rPr>
-        <w:t>móvel dentro do momento atual de oferta e demanda do mercado imobiliário;</w:t>
+        <w:t xml:space="preserve"> do imóvel dentro do momento atual de oferta e demanda do mercado imobiliário;</w:t>
       </w:r>
     </w:p>
     <w:p>
@@ -2793,6 +2390,7 @@
           <w:sz w:val="24"/>
           <w:szCs w:val="24"/>
         </w:rPr>
+        <w:lastRenderedPageBreak/>
         <w:t>ENCERRAMENTO ANTECIPADO DA REPRESENTAÇÃO:</w:t>
       </w:r>
       <w:r>
@@ -2825,58 +2423,36 @@
           <w:sz w:val="24"/>
           <w:szCs w:val="24"/>
         </w:rPr>
-        <w:t>) dar por encerrada a representação imo</w:t>
-      </w:r>
-      <w:r>
-        <w:rPr>
-          <w:sz w:val="24"/>
-          <w:szCs w:val="24"/>
-        </w:rPr>
-        <w:t xml:space="preserve">biliária </w:t>
-      </w:r>
-      <w:r>
-        <w:rPr>
-          <w:sz w:val="24"/>
-          <w:szCs w:val="24"/>
-        </w:rPr>
-        <w:lastRenderedPageBreak/>
-        <w:t>de forma antecipada caso a CONTRATADA descumpra as obrigações previstas na cláusula 2.1, devendo para tanto adotar o procedimento a seguir.</w:t>
-      </w:r>
-    </w:p>
-    <w:p>
-      <w:pPr>
-        <w:spacing w:line="360" w:lineRule="auto"/>
-        <w:ind w:left="-566" w:right="-607"/>
-        <w:jc w:val="both"/>
-        <w:rPr>
-          <w:sz w:val="24"/>
-          <w:szCs w:val="24"/>
-        </w:rPr>
-      </w:pPr>
-    </w:p>
-    <w:p>
-      <w:pPr>
-        <w:spacing w:line="360" w:lineRule="auto"/>
-        <w:ind w:left="-566" w:right="-607"/>
-        <w:jc w:val="both"/>
-        <w:rPr>
-          <w:sz w:val="24"/>
-          <w:szCs w:val="24"/>
-        </w:rPr>
-      </w:pPr>
-      <w:r>
-        <w:rPr>
-          <w:sz w:val="24"/>
-          <w:szCs w:val="24"/>
-        </w:rPr>
-        <w:t>Cláusula 3.1. O(s) CONTRATANTE(S) comunicará a CONTRATADA acerca da infração que entende ter ocorrido, con</w:t>
-      </w:r>
-      <w:r>
-        <w:rPr>
-          <w:sz w:val="24"/>
-          <w:szCs w:val="24"/>
-        </w:rPr>
-        <w:t>cedendo prazo de 30 (trinta dias) úteis para solução ou apresentação da justificativa.</w:t>
+        <w:t>) dar por encerrada a representação imobiliária de forma antecipada caso a CONTRATADA descumpra as obrigações previstas na cláusula 2.1, devendo para tanto adotar o procedimento a seguir.</w:t>
+      </w:r>
+    </w:p>
+    <w:p>
+      <w:pPr>
+        <w:spacing w:line="360" w:lineRule="auto"/>
+        <w:ind w:left="-566" w:right="-607"/>
+        <w:jc w:val="both"/>
+        <w:rPr>
+          <w:sz w:val="24"/>
+          <w:szCs w:val="24"/>
+        </w:rPr>
+      </w:pPr>
+    </w:p>
+    <w:p>
+      <w:pPr>
+        <w:spacing w:line="360" w:lineRule="auto"/>
+        <w:ind w:left="-566" w:right="-607"/>
+        <w:jc w:val="both"/>
+        <w:rPr>
+          <w:sz w:val="24"/>
+          <w:szCs w:val="24"/>
+        </w:rPr>
+      </w:pPr>
+      <w:r>
+        <w:rPr>
+          <w:sz w:val="24"/>
+          <w:szCs w:val="24"/>
+        </w:rPr>
+        <w:t>Cláusula 3.1. O(s) CONTRATANTE(S) comunicará a CONTRATADA acerca da infração que entende ter ocorrido, concedendo prazo de 30 (trinta dias) úteis para solução ou apresentação da justificativa.</w:t>
       </w:r>
     </w:p>
     <w:p>
@@ -2952,14 +2528,7 @@
           <w:sz w:val="24"/>
           <w:szCs w:val="24"/>
         </w:rPr>
-        <w:t>Cláu</w:t>
-      </w:r>
-      <w:r>
-        <w:rPr>
-          <w:sz w:val="24"/>
-          <w:szCs w:val="24"/>
-        </w:rPr>
-        <w:t xml:space="preserve">sula 4. Pelos serviços de intermediação e representação imobiliária o(s) CONTRATANTE(S) pagará à CONTRATADA, ou a quem </w:t>
+        <w:t xml:space="preserve">Cláusula 4. Pelos serviços de intermediação e representação imobiliária o(s) CONTRATANTE(S) pagará à CONTRATADA, ou a quem </w:t>
       </w:r>
       <w:proofErr w:type="spellStart"/>
       <w:r>
@@ -3004,14 +2573,7 @@
           <w:sz w:val="24"/>
           <w:szCs w:val="24"/>
         </w:rPr>
-        <w:t>Cláusula 4.1. A remuneraçã</w:t>
-      </w:r>
-      <w:r>
-        <w:rPr>
-          <w:sz w:val="24"/>
-          <w:szCs w:val="24"/>
-        </w:rPr>
-        <w:t>o da CONTRATADA será também devida nos casos de venda direta do imóvel ou através de terceiros durante a vigência do prazo previsto na cláusula 1.2; (</w:t>
+        <w:t>Cláusula 4.1. A remuneração da CONTRATADA será também devida nos casos de venda direta do imóvel ou através de terceiros durante a vigência do prazo previsto na cláusula 1.2; (</w:t>
       </w:r>
       <w:proofErr w:type="spellStart"/>
       <w:r>
@@ -3059,14 +2621,7 @@
           <w:sz w:val="24"/>
           <w:szCs w:val="24"/>
         </w:rPr>
-        <w:t xml:space="preserve"> porém para interessados prospectados pela CONT</w:t>
-      </w:r>
-      <w:r>
-        <w:rPr>
-          <w:sz w:val="24"/>
-          <w:szCs w:val="24"/>
-        </w:rPr>
-        <w:t>RATADA.</w:t>
+        <w:t xml:space="preserve"> porém para interessados prospectados pela CONTRATADA.</w:t>
       </w:r>
     </w:p>
     <w:p>
@@ -3162,16 +2717,20 @@
           <w:sz w:val="24"/>
           <w:szCs w:val="24"/>
         </w:rPr>
-        <w:t>, sendo legalmente responsável pela guarda, proteção e utilização consciente dos dados pessoai</w:t>
-      </w:r>
-      <w:r>
+        <w:t>, sendo legalmente responsável pela guarda, proteção e utilização consciente dos dados pessoais que vierem a ter acesso em razão deste Contrato, no estrito e rigoroso cumprimento da legislação aplicável, em especial a Lei nº 13.709/2018, que trata da proteção de dados.</w:t>
+      </w:r>
+    </w:p>
+    <w:p>
+      <w:pPr>
+        <w:spacing w:line="360" w:lineRule="auto"/>
+        <w:ind w:left="-566" w:right="-607"/>
+        <w:jc w:val="both"/>
         <w:rPr>
           <w:color w:val="221F1F"/>
           <w:sz w:val="24"/>
           <w:szCs w:val="24"/>
         </w:rPr>
-        <w:t>s que vierem a ter acesso em razão deste Contrato, no estrito e rigoroso cumprimento da legislação aplicável, em especial a Lei nº 13.709/2018, que trata da proteção de dados.</w:t>
-      </w:r>
+      </w:pPr>
     </w:p>
     <w:p>
       <w:pPr>
@@ -3184,92 +2743,63 @@
           <w:szCs w:val="24"/>
         </w:rPr>
       </w:pPr>
-    </w:p>
-    <w:p>
-      <w:pPr>
-        <w:spacing w:line="360" w:lineRule="auto"/>
-        <w:ind w:left="-566" w:right="-607"/>
-        <w:jc w:val="both"/>
+      <w:r>
         <w:rPr>
           <w:color w:val="221F1F"/>
           <w:sz w:val="24"/>
           <w:szCs w:val="24"/>
         </w:rPr>
-      </w:pPr>
+        <w:t xml:space="preserve">Cláusula 5.1. Por dados pessoais entende-se toda e qualquer informação capaz de </w:t>
+      </w:r>
+      <w:proofErr w:type="spellStart"/>
       <w:r>
         <w:rPr>
           <w:color w:val="221F1F"/>
           <w:sz w:val="24"/>
           <w:szCs w:val="24"/>
         </w:rPr>
-        <w:t>Cláusula 5.1. Por dados pessoais entende-se toda e qualquer informação capaz de</w:t>
-      </w:r>
+        <w:t>identiﬁcar</w:t>
+      </w:r>
+      <w:proofErr w:type="spellEnd"/>
       <w:r>
         <w:rPr>
           <w:color w:val="221F1F"/>
           <w:sz w:val="24"/>
           <w:szCs w:val="24"/>
         </w:rPr>
-        <w:t xml:space="preserve"> </w:t>
-      </w:r>
-      <w:proofErr w:type="spellStart"/>
-      <w:r>
+        <w:t xml:space="preserve"> direta ou indiretamente qualquer pessoa, tais como nome, RG, CPF, gênero, data e local de nascimento, endereço residencial ou comercial, número de telefones, dados de contato, entre outros.</w:t>
+      </w:r>
+    </w:p>
+    <w:p>
+      <w:pPr>
+        <w:spacing w:line="360" w:lineRule="auto"/>
+        <w:ind w:left="-566" w:right="-607"/>
+        <w:jc w:val="both"/>
         <w:rPr>
           <w:color w:val="221F1F"/>
           <w:sz w:val="24"/>
           <w:szCs w:val="24"/>
         </w:rPr>
-        <w:t>identiﬁcar</w:t>
-      </w:r>
-      <w:proofErr w:type="spellEnd"/>
-      <w:r>
+      </w:pPr>
+    </w:p>
+    <w:p>
+      <w:pPr>
+        <w:spacing w:line="360" w:lineRule="auto"/>
+        <w:ind w:left="-566" w:right="-607"/>
+        <w:jc w:val="both"/>
         <w:rPr>
           <w:color w:val="221F1F"/>
           <w:sz w:val="24"/>
           <w:szCs w:val="24"/>
         </w:rPr>
-        <w:t xml:space="preserve"> direta ou indiretamente qualquer pessoa, tais como nome, RG, CPF, gênero, data e local de nascimento, endereço residencial ou comercial, número de telefones, dados de contato, entre outros.</w:t>
-      </w:r>
-    </w:p>
-    <w:p>
-      <w:pPr>
-        <w:spacing w:line="360" w:lineRule="auto"/>
-        <w:ind w:left="-566" w:right="-607"/>
-        <w:jc w:val="both"/>
+      </w:pPr>
+      <w:r>
         <w:rPr>
           <w:color w:val="221F1F"/>
           <w:sz w:val="24"/>
           <w:szCs w:val="24"/>
         </w:rPr>
-      </w:pPr>
-    </w:p>
-    <w:p>
-      <w:pPr>
-        <w:spacing w:line="360" w:lineRule="auto"/>
-        <w:ind w:left="-566" w:right="-607"/>
-        <w:jc w:val="both"/>
-        <w:rPr>
-          <w:color w:val="221F1F"/>
-          <w:sz w:val="24"/>
-          <w:szCs w:val="24"/>
-        </w:rPr>
-      </w:pPr>
-      <w:r>
-        <w:rPr>
-          <w:color w:val="221F1F"/>
-          <w:sz w:val="24"/>
-          <w:szCs w:val="24"/>
-        </w:rPr>
-        <w:lastRenderedPageBreak/>
-        <w:t>Cláusula 5.2. Reconhecem as Partes que todos os dados</w:t>
-      </w:r>
-      <w:r>
-        <w:rPr>
-          <w:color w:val="221F1F"/>
-          <w:sz w:val="24"/>
-          <w:szCs w:val="24"/>
-        </w:rPr>
-        <w:t xml:space="preserve"> fornecidos pelo(s) </w:t>
+        <w:t xml:space="preserve">Cláusula 5.2. Reconhecem as Partes que todos os dados fornecidos pelo(s) </w:t>
       </w:r>
       <w:r>
         <w:rPr>
@@ -3323,15 +2853,7 @@
           <w:sz w:val="24"/>
           <w:szCs w:val="24"/>
         </w:rPr>
-        <w:t xml:space="preserve">expressamente consentem com a coleta, uso e compartilhamento dos dados pessoais </w:t>
-      </w:r>
-      <w:r>
-        <w:rPr>
-          <w:color w:val="221F1F"/>
-          <w:sz w:val="24"/>
-          <w:szCs w:val="24"/>
-        </w:rPr>
-        <w:t xml:space="preserve">necessários para o desenvolvimento da atividade </w:t>
+        <w:t xml:space="preserve">expressamente consentem com a coleta, uso e compartilhamento dos dados pessoais necessários para o desenvolvimento da atividade </w:t>
       </w:r>
       <w:proofErr w:type="spellStart"/>
       <w:r>
@@ -3405,45 +2927,37 @@
           <w:sz w:val="24"/>
           <w:szCs w:val="24"/>
         </w:rPr>
-        <w:t>Cláusula 6. As partes declaram terem recebido o presente instrumento com antecedência necessária para a correta e atenta leitura e compreensão de</w:t>
-      </w:r>
-      <w:r>
+        <w:t xml:space="preserve">Cláusula 6. As partes declaram terem recebido o presente instrumento com antecedência necessária para a correta e atenta leitura e compreensão de todos os seus termos, direitos e obrigações, e, ainda, que entendem e concordam com termos e condições aqui ajustados, sendo o presente contrato assinado de forma irrevogável e irretratável. </w:t>
+      </w:r>
+    </w:p>
+    <w:p>
+      <w:pPr>
+        <w:spacing w:line="360" w:lineRule="auto"/>
+        <w:ind w:left="-566" w:right="-607"/>
+        <w:jc w:val="both"/>
         <w:rPr>
           <w:color w:val="221F1F"/>
           <w:sz w:val="24"/>
           <w:szCs w:val="24"/>
         </w:rPr>
-        <w:t xml:space="preserve"> todos os seus termos, direitos e obrigações, e, ainda, que entendem e concordam com termos e condições aqui ajustados, sendo o presente contrato assinado de forma irrevogável e irretratável. </w:t>
-      </w:r>
-    </w:p>
-    <w:p>
-      <w:pPr>
-        <w:spacing w:line="360" w:lineRule="auto"/>
-        <w:ind w:left="-566" w:right="-607"/>
-        <w:jc w:val="both"/>
+      </w:pPr>
+    </w:p>
+    <w:p>
+      <w:pPr>
+        <w:spacing w:line="360" w:lineRule="auto"/>
+        <w:ind w:left="-566" w:right="-607"/>
+        <w:jc w:val="both"/>
+        <w:rPr>
+          <w:sz w:val="24"/>
+          <w:szCs w:val="24"/>
+        </w:rPr>
+      </w:pPr>
+      <w:r>
         <w:rPr>
           <w:color w:val="221F1F"/>
           <w:sz w:val="24"/>
           <w:szCs w:val="24"/>
         </w:rPr>
-      </w:pPr>
-    </w:p>
-    <w:p>
-      <w:pPr>
-        <w:spacing w:line="360" w:lineRule="auto"/>
-        <w:ind w:left="-566" w:right="-607"/>
-        <w:jc w:val="both"/>
-        <w:rPr>
-          <w:sz w:val="24"/>
-          <w:szCs w:val="24"/>
-        </w:rPr>
-      </w:pPr>
-      <w:r>
-        <w:rPr>
-          <w:color w:val="221F1F"/>
-          <w:sz w:val="24"/>
-          <w:szCs w:val="24"/>
-        </w:rPr>
         <w:t xml:space="preserve">Cláusula 7. </w:t>
       </w:r>
       <w:r>
@@ -3453,7 +2967,7 @@
         </w:rPr>
         <w:t xml:space="preserve">6.  Fica eleito o Foro da Comarca de </w:t>
       </w:r>
-      <w:hyperlink r:id="rId19" w:anchor="columnPickerDrawer">
+      <w:hyperlink r:id="rId13" w:anchor="columnPickerDrawer">
         <w:r>
           <w:rPr>
             <w:sz w:val="24"/>
@@ -3470,7 +2984,7 @@
         </w:rPr>
         <w:t xml:space="preserve">, Estado de </w:t>
       </w:r>
-      <w:hyperlink r:id="rId20" w:anchor="columnPickerDrawer">
+      <w:hyperlink r:id="rId14" w:anchor="columnPickerDrawer">
         <w:r>
           <w:rPr>
             <w:sz w:val="24"/>
@@ -3514,14 +3028,7 @@
           <w:sz w:val="24"/>
           <w:szCs w:val="24"/>
         </w:rPr>
-        <w:t>E, por estarem as</w:t>
-      </w:r>
-      <w:r>
-        <w:rPr>
-          <w:sz w:val="24"/>
-          <w:szCs w:val="24"/>
-        </w:rPr>
-        <w:t>sim justas e contratadas, as partes assinam o presente termo em 02 (duas) vias de igual teor e valor na presença de 02 (duas) testemunhas.</w:t>
+        <w:t>E, por estarem assim justas e contratadas, as partes assinam o presente termo em 02 (duas) vias de igual teor e valor na presença de 02 (duas) testemunhas.</w:t>
       </w:r>
     </w:p>
     <w:p>
@@ -3626,14 +3133,7 @@
           <w:sz w:val="24"/>
           <w:szCs w:val="24"/>
         </w:rPr>
-        <w:t>&lt;&lt;Nome / Razão Soci</w:t>
-      </w:r>
-      <w:r>
-        <w:rPr>
-          <w:sz w:val="24"/>
-          <w:szCs w:val="24"/>
-        </w:rPr>
-        <w:t>al&gt;&gt;</w:t>
+        <w:t>&lt;&lt;Nome / Razão Social&gt;&gt;</w:t>
       </w:r>
     </w:p>
     <w:p>
@@ -3742,6 +3242,7 @@
           <w:sz w:val="24"/>
           <w:szCs w:val="24"/>
         </w:rPr>
+        <w:lastRenderedPageBreak/>
         <w:t>Imobiliária Re/</w:t>
       </w:r>
       <w:proofErr w:type="spellStart"/>
@@ -4402,47 +3903,50 @@
             </wp:anchor>
           </w:drawing>
         </mc:Choice>
-        <mc:Fallback xmlns:cr="http://schemas.microsoft.com/office/comments/2020/reactions" xmlns="http://schemas.microsoft.com/office/tasks/2019/documenttasks" xmlns:w16cex="http://schemas.microsoft.com/office/word/2018/wordml/cex" xmlns:w16="http://schemas.microsoft.com/office/word/2018/wordml" xmlns:dgm="http://schemas.openxmlformats.org/drawingml/2006/diagram" xmlns:lc="http://schemas.openxmlformats.org/drawingml/2006/lockedCanvas" xmlns:c="http://schemas.openxmlformats.org/drawingml/2006/chart" xmlns:pic="http://schemas.openxmlformats.org/drawingml/2006/picture" xmlns:a="http://schemas.openxmlformats.org/drawingml/2006/main" xmlns:sl="http://schemas.openxmlformats.org/schemaLibrary/2006/main">
-          <w:drawing>
-            <wp:anchor allowOverlap="1" behindDoc="0" distB="114300" distT="114300" distL="114300" distR="114300" hidden="0" layoutInCell="1" locked="0" relativeHeight="0" simplePos="0">
-              <wp:simplePos x="0" y="0"/>
-              <wp:positionH relativeFrom="column">
-                <wp:posOffset>-942974</wp:posOffset>
-              </wp:positionH>
-              <wp:positionV relativeFrom="paragraph">
-                <wp:posOffset>-341712</wp:posOffset>
-              </wp:positionV>
-              <wp:extent cx="7605713" cy="799081"/>
-              <wp:effectExtent b="0" l="0" r="0" t="0"/>
-              <wp:wrapNone/>
-              <wp:docPr id="1" name="image8.png"/>
-              <a:graphic>
-                <a:graphicData uri="http://schemas.openxmlformats.org/drawingml/2006/picture">
-                  <pic:pic>
-                    <pic:nvPicPr>
-                      <pic:cNvPr id="0" name="image8.png"/>
-                      <pic:cNvPicPr preferRelativeResize="0"/>
-                    </pic:nvPicPr>
-                    <pic:blipFill>
-                      <a:blip r:embed="rId3"/>
-                      <a:srcRect/>
-                      <a:stretch>
-                        <a:fillRect/>
-                      </a:stretch>
-                    </pic:blipFill>
-                    <pic:spPr>
-                      <a:xfrm>
-                        <a:off x="0" y="0"/>
-                        <a:ext cx="7605713" cy="799081"/>
-                      </a:xfrm>
-                      <a:prstGeom prst="rect"/>
-                      <a:ln/>
-                    </pic:spPr>
-                  </pic:pic>
-                </a:graphicData>
-              </a:graphic>
-            </wp:anchor>
-          </w:drawing>
+        <mc:Fallback>
+          <w:pict>
+            <v:group id="Agrupar 1" o:spid="_x0000_s1026" style="position:absolute;margin-left:-74.25pt;margin-top:-26.9pt;width:598.9pt;height:62.9pt;z-index:251658240;mso-wrap-distance-top:9pt;mso-wrap-distance-bottom:9pt" coordorigin=",503" coordsize="121490,12689" o:gfxdata="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">
+              <v:rect id="Retângulo 2" o:spid="_x0000_s1027" style="position:absolute;left:-1338;top:551;width:122781;height:12594;visibility:visible;mso-wrap-style:square;v-text-anchor:middle" o:gfxdata="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" fillcolor="#000e35">
+                <v:stroke startarrowwidth="narrow" startarrowlength="short" endarrowwidth="narrow" endarrowlength="short" joinstyle="round"/>
+                <v:textbox inset="2.53958mm,2.53958mm,2.53958mm,2.53958mm">
+                  <w:txbxContent>
+                    <w:p>
+                      <w:pPr>
+                        <w:spacing w:line="240" w:lineRule="auto"/>
+                        <w:jc w:val="center"/>
+                        <w:textDirection w:val="btLr"/>
+                      </w:pPr>
+                    </w:p>
+                  </w:txbxContent>
+                </v:textbox>
+              </v:rect>
+              <v:shapetype id="_x0000_t75" coordsize="21600,21600" o:spt="75" o:preferrelative="t" path="m@4@5l@4@11@9@11@9@5xe" filled="f" stroked="f">
+                <v:stroke joinstyle="miter"/>
+                <v:formulas>
+                  <v:f eqn="if lineDrawn pixelLineWidth 0"/>
+                  <v:f eqn="sum @0 1 0"/>
+                  <v:f eqn="sum 0 0 @1"/>
+                  <v:f eqn="prod @2 1 2"/>
+                  <v:f eqn="prod @3 21600 pixelWidth"/>
+                  <v:f eqn="prod @3 21600 pixelHeight"/>
+                  <v:f eqn="sum @0 0 1"/>
+                  <v:f eqn="prod @6 1 2"/>
+                  <v:f eqn="prod @7 21600 pixelWidth"/>
+                  <v:f eqn="sum @8 21600 0"/>
+                  <v:f eqn="prod @7 21600 pixelHeight"/>
+                  <v:f eqn="sum @10 21600 0"/>
+                </v:formulas>
+                <v:path o:extrusionok="f" gradientshapeok="t" o:connecttype="rect"/>
+                <o:lock v:ext="edit" aspectratio="t"/>
+              </v:shapetype>
+              <v:shape id="Shape 3" o:spid="_x0000_s1028" type="#_x0000_t75" style="position:absolute;left:219;top:551;width:12375;height:12374;visibility:visible;mso-wrap-style:square" o:preferrelative="f" o:gfxdata="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">
+                <v:imagedata r:id="rId3" o:title=""/>
+              </v:shape>
+              <v:shape id="Shape 4" o:spid="_x0000_s1029" type="#_x0000_t75" style="position:absolute;left:98922;top:1641;width:17717;height:10413;visibility:visible;mso-wrap-style:square" o:preferrelative="f" o:gfxdata="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">
+                <v:imagedata r:id="rId4" o:title="" croptop="13208f" cropbottom="13809f"/>
+              </v:shape>
+            </v:group>
+          </w:pict>
         </mc:Fallback>
       </mc:AlternateContent>
     </w:r>

</xml_diff>

<commit_message>
Notícias: upload de imagem, mural do Portal do Corretor, preview WhatsApp
</commit_message>
<xml_diff>
--- a/templates/Contrato de gestão __Nome _ Razão Social__.docx
+++ b/templates/Contrato de gestão __Nome _ Razão Social__.docx
@@ -691,8 +691,6 @@
           <w:szCs w:val="24"/>
         </w:rPr>
       </w:pPr>
-      <w:bookmarkStart w:id="0" w:name="_GoBack"/>
-      <w:bookmarkEnd w:id="0"/>
       <w:r>
         <w:rPr>
           <w:sz w:val="24"/>
@@ -915,7 +913,37 @@
                 <w:sz w:val="24"/>
                 <w:szCs w:val="24"/>
               </w:rPr>
-              <w:t>&lt;&lt;Nome / Razão Social&gt;&gt;</w:t>
+              <w:t>{{</w:t>
+            </w:r>
+            <w:proofErr w:type="spellStart"/>
+            <w:r>
+              <w:rPr>
+                <w:sz w:val="24"/>
+                <w:szCs w:val="24"/>
+              </w:rPr>
+              <w:t>NomeRaz</w:t>
+            </w:r>
+            <w:r>
+              <w:rPr>
+                <w:sz w:val="24"/>
+                <w:szCs w:val="24"/>
+              </w:rPr>
+              <w:t>a</w:t>
+            </w:r>
+            <w:r>
+              <w:rPr>
+                <w:sz w:val="24"/>
+                <w:szCs w:val="24"/>
+              </w:rPr>
+              <w:t>oSocial</w:t>
+            </w:r>
+            <w:proofErr w:type="spellEnd"/>
+            <w:r>
+              <w:rPr>
+                <w:sz w:val="24"/>
+                <w:szCs w:val="24"/>
+              </w:rPr>
+              <w:t>}}</w:t>
             </w:r>
           </w:p>
         </w:tc>
@@ -943,7 +971,7 @@
                 <w:sz w:val="24"/>
                 <w:szCs w:val="24"/>
               </w:rPr>
-              <w:t>&lt;&lt;RG&gt;&gt;</w:t>
+              <w:t>{{RG}}</w:t>
             </w:r>
           </w:p>
         </w:tc>
@@ -971,7 +999,23 @@
                 <w:sz w:val="24"/>
                 <w:szCs w:val="24"/>
               </w:rPr>
-              <w:t>&lt;&lt;CPF / CNPJ&gt;&gt;</w:t>
+              <w:t>{{</w:t>
+            </w:r>
+            <w:proofErr w:type="spellStart"/>
+            <w:r>
+              <w:rPr>
+                <w:sz w:val="24"/>
+                <w:szCs w:val="24"/>
+              </w:rPr>
+              <w:t>CpfCnpj</w:t>
+            </w:r>
+            <w:proofErr w:type="spellEnd"/>
+            <w:r>
+              <w:rPr>
+                <w:sz w:val="24"/>
+                <w:szCs w:val="24"/>
+              </w:rPr>
+              <w:t>}}</w:t>
             </w:r>
           </w:p>
         </w:tc>
@@ -1093,7 +1137,23 @@
                 <w:sz w:val="24"/>
                 <w:szCs w:val="24"/>
               </w:rPr>
-              <w:t>&lt;&lt;Endereço completo&gt;&gt;</w:t>
+              <w:t>{{</w:t>
+            </w:r>
+            <w:proofErr w:type="spellStart"/>
+            <w:r>
+              <w:rPr>
+                <w:sz w:val="24"/>
+                <w:szCs w:val="24"/>
+              </w:rPr>
+              <w:t>EnderecoCompleto</w:t>
+            </w:r>
+            <w:proofErr w:type="spellEnd"/>
+            <w:r>
+              <w:rPr>
+                <w:sz w:val="24"/>
+                <w:szCs w:val="24"/>
+              </w:rPr>
+              <w:t>}}</w:t>
             </w:r>
           </w:p>
         </w:tc>
@@ -1121,7 +1181,7 @@
                 <w:sz w:val="24"/>
                 <w:szCs w:val="24"/>
               </w:rPr>
-              <w:t>&lt;&lt;Nacionalidade&gt;&gt;</w:t>
+              <w:t>{{Nacionalidade}}</w:t>
             </w:r>
           </w:p>
         </w:tc>
@@ -1149,7 +1209,23 @@
                 <w:sz w:val="24"/>
                 <w:szCs w:val="24"/>
               </w:rPr>
-              <w:t>&lt;&lt;Estado Civil&gt;&gt;</w:t>
+              <w:t>{{</w:t>
+            </w:r>
+            <w:proofErr w:type="spellStart"/>
+            <w:r>
+              <w:rPr>
+                <w:sz w:val="24"/>
+                <w:szCs w:val="24"/>
+              </w:rPr>
+              <w:t>EstadoCivil</w:t>
+            </w:r>
+            <w:proofErr w:type="spellEnd"/>
+            <w:r>
+              <w:rPr>
+                <w:sz w:val="24"/>
+                <w:szCs w:val="24"/>
+              </w:rPr>
+              <w:t>}}</w:t>
             </w:r>
           </w:p>
         </w:tc>
@@ -1271,7 +1347,7 @@
                 <w:sz w:val="24"/>
                 <w:szCs w:val="24"/>
               </w:rPr>
-              <w:t>&lt;&lt;E-mail&gt;&gt;</w:t>
+              <w:t>{{Email}}</w:t>
             </w:r>
           </w:p>
         </w:tc>
@@ -1299,7 +1375,23 @@
                 <w:sz w:val="24"/>
                 <w:szCs w:val="24"/>
               </w:rPr>
-              <w:t>&lt;&lt;Telefone celular&gt;&gt;</w:t>
+              <w:t>{{</w:t>
+            </w:r>
+            <w:proofErr w:type="spellStart"/>
+            <w:r>
+              <w:rPr>
+                <w:sz w:val="24"/>
+                <w:szCs w:val="24"/>
+              </w:rPr>
+              <w:t>TelefoneCelular</w:t>
+            </w:r>
+            <w:proofErr w:type="spellEnd"/>
+            <w:r>
+              <w:rPr>
+                <w:sz w:val="24"/>
+                <w:szCs w:val="24"/>
+              </w:rPr>
+              <w:t>}}</w:t>
             </w:r>
           </w:p>
         </w:tc>
@@ -1327,7 +1419,23 @@
                 <w:sz w:val="24"/>
                 <w:szCs w:val="24"/>
               </w:rPr>
-              <w:t>&lt;&lt;Telefone reserva&gt;&gt;</w:t>
+              <w:t>{{</w:t>
+            </w:r>
+            <w:proofErr w:type="spellStart"/>
+            <w:r>
+              <w:rPr>
+                <w:sz w:val="24"/>
+                <w:szCs w:val="24"/>
+              </w:rPr>
+              <w:t>TelefoneReserva</w:t>
+            </w:r>
+            <w:proofErr w:type="spellEnd"/>
+            <w:r>
+              <w:rPr>
+                <w:sz w:val="24"/>
+                <w:szCs w:val="24"/>
+              </w:rPr>
+              <w:t>}}</w:t>
             </w:r>
           </w:p>
         </w:tc>
@@ -1358,7 +1466,30 @@
                 <w:sz w:val="24"/>
                 <w:szCs w:val="24"/>
               </w:rPr>
-              <w:t>Inscrição municipal: &lt;&lt;Inscricao&gt;&gt;</w:t>
+              <w:t xml:space="preserve">Inscrição municipal: </w:t>
+            </w:r>
+            <w:r>
+              <w:rPr>
+                <w:sz w:val="24"/>
+                <w:szCs w:val="24"/>
+              </w:rPr>
+              <w:t>{{</w:t>
+            </w:r>
+            <w:proofErr w:type="spellStart"/>
+            <w:r>
+              <w:rPr>
+                <w:sz w:val="24"/>
+                <w:szCs w:val="24"/>
+              </w:rPr>
+              <w:t>InscricaoMunicipal</w:t>
+            </w:r>
+            <w:proofErr w:type="spellEnd"/>
+            <w:r>
+              <w:rPr>
+                <w:sz w:val="24"/>
+                <w:szCs w:val="24"/>
+              </w:rPr>
+              <w:t>}}</w:t>
             </w:r>
           </w:p>
         </w:tc>
@@ -1532,7 +1663,23 @@
                 <w:sz w:val="24"/>
                 <w:szCs w:val="24"/>
               </w:rPr>
-              <w:t>&lt;&lt;Tipo do imóvel&gt;&gt;</w:t>
+              <w:t>{{</w:t>
+            </w:r>
+            <w:proofErr w:type="spellStart"/>
+            <w:r>
+              <w:rPr>
+                <w:sz w:val="24"/>
+                <w:szCs w:val="24"/>
+              </w:rPr>
+              <w:t>TipoImovel</w:t>
+            </w:r>
+            <w:proofErr w:type="spellEnd"/>
+            <w:r>
+              <w:rPr>
+                <w:sz w:val="24"/>
+                <w:szCs w:val="24"/>
+              </w:rPr>
+              <w:t>}}</w:t>
             </w:r>
           </w:p>
         </w:tc>
@@ -1560,7 +1707,7 @@
                 <w:sz w:val="24"/>
                 <w:szCs w:val="24"/>
               </w:rPr>
-              <w:t>&lt;&lt;Rua&gt;&gt;</w:t>
+              <w:t>{{Rua}}</w:t>
             </w:r>
           </w:p>
         </w:tc>
@@ -1588,7 +1735,7 @@
                 <w:sz w:val="24"/>
                 <w:szCs w:val="24"/>
               </w:rPr>
-              <w:t>&lt;&lt;Número predial&gt;&gt;</w:t>
+              <w:t>{{Numero}}</w:t>
             </w:r>
           </w:p>
         </w:tc>
@@ -1710,7 +1857,7 @@
                 <w:sz w:val="24"/>
                 <w:szCs w:val="24"/>
               </w:rPr>
-              <w:t>&lt;&lt;Complemento&gt;&gt;</w:t>
+              <w:t>{{Complemento}}</w:t>
             </w:r>
           </w:p>
         </w:tc>
@@ -1738,7 +1885,7 @@
                 <w:sz w:val="24"/>
                 <w:szCs w:val="24"/>
               </w:rPr>
-              <w:t>&lt;&lt;Bairro&gt;&gt;</w:t>
+              <w:t>{{Bairro}}</w:t>
             </w:r>
           </w:p>
         </w:tc>
@@ -1766,7 +1913,7 @@
                 <w:sz w:val="24"/>
                 <w:szCs w:val="24"/>
               </w:rPr>
-              <w:t>&lt;&lt;Cidade&gt;&gt;</w:t>
+              <w:t>{{Cidade}}</w:t>
             </w:r>
           </w:p>
         </w:tc>
@@ -1888,7 +2035,7 @@
                 <w:sz w:val="24"/>
                 <w:szCs w:val="24"/>
               </w:rPr>
-              <w:t>&lt;&lt;Estado&gt;&gt;</w:t>
+              <w:t>{{Estado}}</w:t>
             </w:r>
           </w:p>
         </w:tc>
@@ -1916,7 +2063,23 @@
                 <w:sz w:val="24"/>
                 <w:szCs w:val="24"/>
               </w:rPr>
-              <w:t>&lt;&lt;Número da matrícula&gt;&gt;</w:t>
+              <w:t>{{</w:t>
+            </w:r>
+            <w:proofErr w:type="spellStart"/>
+            <w:r>
+              <w:rPr>
+                <w:sz w:val="24"/>
+                <w:szCs w:val="24"/>
+              </w:rPr>
+              <w:t>NumeroMatricula</w:t>
+            </w:r>
+            <w:proofErr w:type="spellEnd"/>
+            <w:r>
+              <w:rPr>
+                <w:sz w:val="24"/>
+                <w:szCs w:val="24"/>
+              </w:rPr>
+              <w:t>}}</w:t>
             </w:r>
           </w:p>
         </w:tc>
@@ -1944,7 +2107,23 @@
                 <w:sz w:val="24"/>
                 <w:szCs w:val="24"/>
               </w:rPr>
-              <w:t>&lt;&lt;Valor do imóvel&gt;&gt;</w:t>
+              <w:t>{{</w:t>
+            </w:r>
+            <w:proofErr w:type="spellStart"/>
+            <w:r>
+              <w:rPr>
+                <w:sz w:val="24"/>
+                <w:szCs w:val="24"/>
+              </w:rPr>
+              <w:t>ValorImovel</w:t>
+            </w:r>
+            <w:proofErr w:type="spellEnd"/>
+            <w:r>
+              <w:rPr>
+                <w:sz w:val="24"/>
+                <w:szCs w:val="24"/>
+              </w:rPr>
+              <w:t>}}</w:t>
             </w:r>
           </w:p>
         </w:tc>
@@ -2037,7 +2216,7 @@
           <w:sz w:val="24"/>
           <w:szCs w:val="24"/>
         </w:rPr>
-        <w:t xml:space="preserve">Cláusula 1. O presente contrato tem por objeto a prestação de serviços de intermediação e representação imobiliária pela CONTRATADA ao(s) CONTRATANTE(S), nos termos dos artigos </w:t>
+        <w:t xml:space="preserve">Cláusula 1. O presente contrato tem por objeto a prestação de serviços de intermediação e representação imobiliária pela CONTRATADA ao(s) CONTRATANTE(S), nos termos dos artigos 722 e seguintes do código civil brasileiro, com relação ao </w:t>
       </w:r>
       <w:r>
         <w:rPr>
@@ -2045,52 +2224,94 @@
           <w:sz w:val="24"/>
           <w:szCs w:val="24"/>
         </w:rPr>
+        <w:t>imóvel</w:t>
+      </w:r>
+      <w:r>
+        <w:rPr>
+          <w:color w:val="221F1F"/>
+          <w:sz w:val="24"/>
+          <w:szCs w:val="24"/>
+        </w:rPr>
+        <w:t xml:space="preserve"> descrito no presente instrumento. </w:t>
+      </w:r>
+    </w:p>
+    <w:p>
+      <w:pPr>
+        <w:spacing w:line="360" w:lineRule="auto"/>
+        <w:ind w:left="-566" w:right="-607"/>
+        <w:jc w:val="both"/>
+        <w:rPr>
+          <w:sz w:val="24"/>
+          <w:szCs w:val="24"/>
+        </w:rPr>
+      </w:pPr>
+      <w:r>
+        <w:rPr>
+          <w:color w:val="221F1F"/>
+          <w:sz w:val="24"/>
+          <w:szCs w:val="24"/>
+        </w:rPr>
         <w:lastRenderedPageBreak/>
-        <w:t xml:space="preserve">722 e seguintes do código civil brasileiro, com relação ao </w:t>
+        <w:t xml:space="preserve">Cláusula 1.1. </w:t>
+      </w:r>
+      <w:r>
+        <w:rPr>
+          <w:sz w:val="24"/>
+          <w:szCs w:val="24"/>
+        </w:rPr>
+        <w:t xml:space="preserve">Adicionalmente aos serviços de intermediação previstos em lei, a CONTRATADA prestará aos CONTRATANTE(S) os serviços </w:t>
       </w:r>
       <w:proofErr w:type="spellStart"/>
       <w:r>
         <w:rPr>
-          <w:color w:val="221F1F"/>
-          <w:sz w:val="24"/>
-          <w:szCs w:val="24"/>
-        </w:rPr>
-        <w:t>imovel</w:t>
+          <w:sz w:val="24"/>
+          <w:szCs w:val="24"/>
+        </w:rPr>
+        <w:t>proﬁssionais</w:t>
       </w:r>
       <w:proofErr w:type="spellEnd"/>
       <w:r>
         <w:rPr>
-          <w:color w:val="221F1F"/>
-          <w:sz w:val="24"/>
-          <w:szCs w:val="24"/>
-        </w:rPr>
-        <w:t xml:space="preserve"> descrito no presente instrumento. </w:t>
-      </w:r>
-    </w:p>
-    <w:p>
-      <w:pPr>
-        <w:spacing w:line="360" w:lineRule="auto"/>
-        <w:ind w:left="-566" w:right="-607"/>
-        <w:jc w:val="both"/>
-        <w:rPr>
-          <w:sz w:val="24"/>
-          <w:szCs w:val="24"/>
-        </w:rPr>
-      </w:pPr>
-      <w:r>
-        <w:rPr>
-          <w:color w:val="221F1F"/>
-          <w:sz w:val="24"/>
-          <w:szCs w:val="24"/>
-        </w:rPr>
-        <w:t xml:space="preserve">Cláusula 1.1. </w:t>
-      </w:r>
-      <w:r>
-        <w:rPr>
-          <w:sz w:val="24"/>
-          <w:szCs w:val="24"/>
-        </w:rPr>
-        <w:t xml:space="preserve">Adicionalmente aos serviços de intermediação previstos em lei, a CONTRATADA prestará aos CONTRATANTE(S) os serviços </w:t>
+          <w:sz w:val="24"/>
+          <w:szCs w:val="24"/>
+        </w:rPr>
+        <w:t xml:space="preserve"> previstos na cláusula 2.1 correndo por conta da CONTRATADA os respectivos custos e investimentos necessários para tanto.</w:t>
+      </w:r>
+    </w:p>
+    <w:p>
+      <w:pPr>
+        <w:spacing w:line="360" w:lineRule="auto"/>
+        <w:ind w:left="-566" w:right="-607"/>
+        <w:jc w:val="both"/>
+        <w:rPr>
+          <w:sz w:val="24"/>
+          <w:szCs w:val="24"/>
+        </w:rPr>
+      </w:pPr>
+    </w:p>
+    <w:p>
+      <w:pPr>
+        <w:spacing w:line="360" w:lineRule="auto"/>
+        <w:ind w:left="-566" w:right="-607"/>
+        <w:jc w:val="both"/>
+        <w:rPr>
+          <w:sz w:val="24"/>
+          <w:szCs w:val="24"/>
+        </w:rPr>
+      </w:pPr>
+      <w:r>
+        <w:rPr>
+          <w:sz w:val="24"/>
+          <w:szCs w:val="24"/>
+        </w:rPr>
+        <w:t xml:space="preserve">Cláusula 1.2. Como contrapartida, o(s) CONTRATANTE(S) garantirão à CONTRATADA o exercício exclusivo da representação imobiliária relativamente ao imóvel, sendo portanto a CONTRATADA a única nomeada para intermediar e representar o(s) CONTRATANTE(S) perante o mercado com relação ao imóvel pelo prazo de </w:t>
+      </w:r>
+      <w:r>
+        <w:rPr>
+          <w:sz w:val="24"/>
+          <w:szCs w:val="24"/>
+        </w:rPr>
+        <w:t>{{</w:t>
       </w:r>
       <w:proofErr w:type="spellStart"/>
       <w:r>
@@ -2098,7 +2319,7 @@
           <w:sz w:val="24"/>
           <w:szCs w:val="24"/>
         </w:rPr>
-        <w:t>proﬁssionais</w:t>
+        <w:t>PrazoGestao</w:t>
       </w:r>
       <w:proofErr w:type="spellEnd"/>
       <w:r>
@@ -2106,36 +2327,14 @@
           <w:sz w:val="24"/>
           <w:szCs w:val="24"/>
         </w:rPr>
-        <w:t xml:space="preserve"> previstos na cláusula 2.1 correndo por conta da CONTRATADA os respectivos custos e investimentos necessários para tanto.</w:t>
-      </w:r>
-    </w:p>
-    <w:p>
-      <w:pPr>
-        <w:spacing w:line="360" w:lineRule="auto"/>
-        <w:ind w:left="-566" w:right="-607"/>
-        <w:jc w:val="both"/>
-        <w:rPr>
-          <w:sz w:val="24"/>
-          <w:szCs w:val="24"/>
-        </w:rPr>
-      </w:pPr>
-    </w:p>
-    <w:p>
-      <w:pPr>
-        <w:spacing w:line="360" w:lineRule="auto"/>
-        <w:ind w:left="-566" w:right="-607"/>
-        <w:jc w:val="both"/>
-        <w:rPr>
-          <w:sz w:val="24"/>
-          <w:szCs w:val="24"/>
-        </w:rPr>
-      </w:pPr>
-      <w:r>
-        <w:rPr>
-          <w:sz w:val="24"/>
-          <w:szCs w:val="24"/>
-        </w:rPr>
-        <w:t>Cláusula 1.2. Como contrapartida, o(s) CONTRATANTE(S) garantirão à CONTRATADA o exercício exclusivo da representação imobiliária relativamente ao imóvel, sendo portanto a CONTRATADA a única nomeada para intermediar e representar o(s) CONTRATANTE(S) perante o mercado com relação ao imóvel pelo prazo de &lt;&lt;Prazo da gestão&gt;&gt; dias contados da data de assinatura do presente instrumento, renováveis por igual período, salvo manifestação contrária das Partes.</w:t>
+        <w:t>}}</w:t>
+      </w:r>
+      <w:r>
+        <w:rPr>
+          <w:sz w:val="24"/>
+          <w:szCs w:val="24"/>
+        </w:rPr>
+        <w:t xml:space="preserve"> dias contados da data de assinatura do presente instrumento, renováveis por igual período, salvo manifestação contrária das Partes.</w:t>
       </w:r>
     </w:p>
     <w:p>
@@ -2390,7 +2589,6 @@
           <w:sz w:val="24"/>
           <w:szCs w:val="24"/>
         </w:rPr>
-        <w:lastRenderedPageBreak/>
         <w:t>ENCERRAMENTO ANTECIPADO DA REPRESENTAÇÃO:</w:t>
       </w:r>
       <w:r>
@@ -2423,7 +2621,15 @@
           <w:sz w:val="24"/>
           <w:szCs w:val="24"/>
         </w:rPr>
-        <w:t>) dar por encerrada a representação imobiliária de forma antecipada caso a CONTRATADA descumpra as obrigações previstas na cláusula 2.1, devendo para tanto adotar o procedimento a seguir.</w:t>
+        <w:t xml:space="preserve">) dar por encerrada a representação imobiliária </w:t>
+      </w:r>
+      <w:r>
+        <w:rPr>
+          <w:sz w:val="24"/>
+          <w:szCs w:val="24"/>
+        </w:rPr>
+        <w:lastRenderedPageBreak/>
+        <w:t>de forma antecipada caso a CONTRATADA descumpra as obrigações previstas na cláusula 2.1, devendo para tanto adotar o procedimento a seguir.</w:t>
       </w:r>
     </w:p>
     <w:p>
@@ -2544,7 +2750,46 @@
           <w:sz w:val="24"/>
           <w:szCs w:val="24"/>
         </w:rPr>
-        <w:t xml:space="preserve"> indicar, uma remuneração correspondente a &lt;&lt;Porcentagem Honorários&gt;&gt;% do valor bruto de venda do imóvel.</w:t>
+        <w:t xml:space="preserve"> indicar, uma remuneração correspondente a </w:t>
+      </w:r>
+      <w:r>
+        <w:rPr>
+          <w:sz w:val="24"/>
+          <w:szCs w:val="24"/>
+        </w:rPr>
+        <w:t>{{</w:t>
+      </w:r>
+      <w:proofErr w:type="spellStart"/>
+      <w:r>
+        <w:rPr>
+          <w:sz w:val="24"/>
+          <w:szCs w:val="24"/>
+        </w:rPr>
+        <w:t>PorcentagemHonorarios</w:t>
+      </w:r>
+      <w:proofErr w:type="spellEnd"/>
+      <w:proofErr w:type="gramStart"/>
+      <w:r>
+        <w:rPr>
+          <w:sz w:val="24"/>
+          <w:szCs w:val="24"/>
+        </w:rPr>
+        <w:t>}}</w:t>
+      </w:r>
+      <w:r>
+        <w:rPr>
+          <w:sz w:val="24"/>
+          <w:szCs w:val="24"/>
+        </w:rPr>
+        <w:t>%</w:t>
+      </w:r>
+      <w:proofErr w:type="gramEnd"/>
+      <w:r>
+        <w:rPr>
+          <w:sz w:val="24"/>
+          <w:szCs w:val="24"/>
+        </w:rPr>
+        <w:t xml:space="preserve"> do valor bruto de venda do imóvel.</w:t>
       </w:r>
     </w:p>
     <w:p>
@@ -2799,6 +3044,7 @@
           <w:sz w:val="24"/>
           <w:szCs w:val="24"/>
         </w:rPr>
+        <w:lastRenderedPageBreak/>
         <w:t xml:space="preserve">Cláusula 5.2. Reconhecem as Partes que todos os dados fornecidos pelo(s) </w:t>
       </w:r>
       <w:r>
@@ -3057,7 +3303,72 @@
           <w:sz w:val="24"/>
           <w:szCs w:val="24"/>
         </w:rPr>
-        <w:t>&lt;&lt;Cidade&gt;&gt;, &lt;&lt;Estado&gt;&gt; - &lt;&lt;Data do Fechamento&gt;&gt;.</w:t>
+        <w:t>{{Cidade}}</w:t>
+      </w:r>
+      <w:r>
+        <w:rPr>
+          <w:sz w:val="24"/>
+          <w:szCs w:val="24"/>
+        </w:rPr>
+        <w:t xml:space="preserve">, </w:t>
+      </w:r>
+      <w:r>
+        <w:rPr>
+          <w:sz w:val="24"/>
+          <w:szCs w:val="24"/>
+        </w:rPr>
+        <w:t>{{Estado}}</w:t>
+      </w:r>
+      <w:r>
+        <w:rPr>
+          <w:sz w:val="24"/>
+          <w:szCs w:val="24"/>
+        </w:rPr>
+        <w:t xml:space="preserve"> </w:t>
+      </w:r>
+      <w:r>
+        <w:rPr>
+          <w:sz w:val="24"/>
+          <w:szCs w:val="24"/>
+        </w:rPr>
+        <w:t>–</w:t>
+      </w:r>
+      <w:r>
+        <w:rPr>
+          <w:sz w:val="24"/>
+          <w:szCs w:val="24"/>
+        </w:rPr>
+        <w:t xml:space="preserve"> </w:t>
+      </w:r>
+      <w:r>
+        <w:rPr>
+          <w:sz w:val="24"/>
+          <w:szCs w:val="24"/>
+        </w:rPr>
+        <w:t>{{</w:t>
+      </w:r>
+      <w:proofErr w:type="spellStart"/>
+      <w:r>
+        <w:rPr>
+          <w:sz w:val="24"/>
+          <w:szCs w:val="24"/>
+        </w:rPr>
+        <w:t>DataFechamento</w:t>
+      </w:r>
+      <w:proofErr w:type="spellEnd"/>
+      <w:r>
+        <w:rPr>
+          <w:sz w:val="24"/>
+          <w:szCs w:val="24"/>
+        </w:rPr>
+        <w:t>}}</w:t>
+      </w:r>
+      <w:r>
+        <w:rPr>
+          <w:sz w:val="24"/>
+          <w:szCs w:val="24"/>
+        </w:rPr>
+        <w:t>.</w:t>
       </w:r>
     </w:p>
     <w:p>
@@ -3097,6 +3408,95 @@
           <w:sz w:val="24"/>
           <w:szCs w:val="24"/>
         </w:rPr>
+        <w:t>{{</w:t>
+      </w:r>
+      <w:proofErr w:type="spellStart"/>
+      <w:r>
+        <w:rPr>
+          <w:sz w:val="24"/>
+          <w:szCs w:val="24"/>
+        </w:rPr>
+        <w:t>AssinaturasAdicionais</w:t>
+      </w:r>
+      <w:proofErr w:type="spellEnd"/>
+      <w:r>
+        <w:rPr>
+          <w:sz w:val="24"/>
+          <w:szCs w:val="24"/>
+        </w:rPr>
+        <w:t>}}</w:t>
+      </w:r>
+    </w:p>
+    <w:p>
+      <w:pPr>
+        <w:spacing w:line="360" w:lineRule="auto"/>
+        <w:ind w:left="-566" w:right="-607"/>
+        <w:jc w:val="center"/>
+        <w:rPr>
+          <w:sz w:val="24"/>
+          <w:szCs w:val="24"/>
+        </w:rPr>
+      </w:pPr>
+    </w:p>
+    <w:p>
+      <w:pPr>
+        <w:spacing w:line="360" w:lineRule="auto"/>
+        <w:ind w:left="-566" w:right="-607"/>
+        <w:jc w:val="center"/>
+        <w:rPr>
+          <w:sz w:val="24"/>
+          <w:szCs w:val="24"/>
+        </w:rPr>
+      </w:pPr>
+    </w:p>
+    <w:p>
+      <w:pPr>
+        <w:spacing w:line="360" w:lineRule="auto"/>
+        <w:ind w:left="-566" w:right="-607"/>
+        <w:jc w:val="center"/>
+        <w:rPr>
+          <w:sz w:val="24"/>
+          <w:szCs w:val="24"/>
+        </w:rPr>
+      </w:pPr>
+    </w:p>
+    <w:p>
+      <w:pPr>
+        <w:spacing w:line="360" w:lineRule="auto"/>
+        <w:ind w:left="-566" w:right="-607"/>
+        <w:jc w:val="center"/>
+        <w:rPr>
+          <w:sz w:val="24"/>
+          <w:szCs w:val="24"/>
+        </w:rPr>
+      </w:pPr>
+    </w:p>
+    <w:p>
+      <w:pPr>
+        <w:spacing w:line="360" w:lineRule="auto"/>
+        <w:ind w:left="-566" w:right="-607"/>
+        <w:jc w:val="center"/>
+        <w:rPr>
+          <w:sz w:val="24"/>
+          <w:szCs w:val="24"/>
+        </w:rPr>
+      </w:pPr>
+    </w:p>
+    <w:p>
+      <w:pPr>
+        <w:spacing w:line="360" w:lineRule="auto"/>
+        <w:ind w:left="-566" w:right="-607"/>
+        <w:jc w:val="center"/>
+        <w:rPr>
+          <w:sz w:val="24"/>
+          <w:szCs w:val="24"/>
+        </w:rPr>
+      </w:pPr>
+      <w:r>
+        <w:rPr>
+          <w:sz w:val="24"/>
+          <w:szCs w:val="24"/>
+        </w:rPr>
         <w:t>_________________________________</w:t>
       </w:r>
     </w:p>
@@ -3115,7 +3515,7 @@
           <w:sz w:val="24"/>
           <w:szCs w:val="24"/>
         </w:rPr>
-        <w:t>CONTRATANTE</w:t>
+        <w:t>CONTRATADA</w:t>
       </w:r>
     </w:p>
     <w:p>
@@ -3133,127 +3533,17 @@
           <w:sz w:val="24"/>
           <w:szCs w:val="24"/>
         </w:rPr>
-        <w:t>&lt;&lt;Nome / Razão Social&gt;&gt;</w:t>
-      </w:r>
-    </w:p>
-    <w:p>
-      <w:pPr>
-        <w:spacing w:line="360" w:lineRule="auto"/>
-        <w:ind w:left="-566" w:right="-607"/>
-        <w:jc w:val="center"/>
-        <w:rPr>
-          <w:sz w:val="24"/>
-          <w:szCs w:val="24"/>
-        </w:rPr>
-      </w:pPr>
-    </w:p>
-    <w:p>
-      <w:pPr>
-        <w:spacing w:line="360" w:lineRule="auto"/>
-        <w:ind w:left="-566" w:right="-607"/>
-        <w:jc w:val="center"/>
-        <w:rPr>
-          <w:sz w:val="24"/>
-          <w:szCs w:val="24"/>
-        </w:rPr>
-      </w:pPr>
-    </w:p>
-    <w:p>
-      <w:pPr>
-        <w:spacing w:line="360" w:lineRule="auto"/>
-        <w:ind w:left="-566" w:right="-607"/>
-        <w:jc w:val="center"/>
-        <w:rPr>
-          <w:sz w:val="24"/>
-          <w:szCs w:val="24"/>
-        </w:rPr>
-      </w:pPr>
-    </w:p>
-    <w:p>
-      <w:pPr>
-        <w:spacing w:line="360" w:lineRule="auto"/>
-        <w:ind w:left="-566" w:right="-607"/>
-        <w:jc w:val="center"/>
-        <w:rPr>
-          <w:sz w:val="24"/>
-          <w:szCs w:val="24"/>
-        </w:rPr>
-      </w:pPr>
-    </w:p>
-    <w:p>
-      <w:pPr>
-        <w:spacing w:line="360" w:lineRule="auto"/>
-        <w:ind w:left="-566" w:right="-607"/>
-        <w:jc w:val="center"/>
-        <w:rPr>
-          <w:sz w:val="24"/>
-          <w:szCs w:val="24"/>
-        </w:rPr>
-      </w:pPr>
-    </w:p>
-    <w:p>
-      <w:pPr>
-        <w:spacing w:line="360" w:lineRule="auto"/>
-        <w:ind w:left="-566" w:right="-607"/>
-        <w:jc w:val="center"/>
-        <w:rPr>
-          <w:sz w:val="24"/>
-          <w:szCs w:val="24"/>
-        </w:rPr>
-      </w:pPr>
-      <w:r>
-        <w:rPr>
-          <w:sz w:val="24"/>
-          <w:szCs w:val="24"/>
-        </w:rPr>
-        <w:t>_________________________________</w:t>
-      </w:r>
-    </w:p>
-    <w:p>
-      <w:pPr>
-        <w:spacing w:line="360" w:lineRule="auto"/>
-        <w:ind w:left="-566" w:right="-607"/>
-        <w:jc w:val="center"/>
-        <w:rPr>
-          <w:sz w:val="24"/>
-          <w:szCs w:val="24"/>
-        </w:rPr>
-      </w:pPr>
-      <w:r>
-        <w:rPr>
-          <w:sz w:val="24"/>
-          <w:szCs w:val="24"/>
-        </w:rPr>
-        <w:t>CONTRATADA</w:t>
-      </w:r>
-    </w:p>
-    <w:p>
-      <w:pPr>
-        <w:spacing w:line="360" w:lineRule="auto"/>
-        <w:ind w:left="-566" w:right="-607"/>
-        <w:jc w:val="center"/>
-        <w:rPr>
-          <w:sz w:val="24"/>
-          <w:szCs w:val="24"/>
-        </w:rPr>
-      </w:pPr>
-      <w:r>
-        <w:rPr>
-          <w:sz w:val="24"/>
-          <w:szCs w:val="24"/>
-        </w:rPr>
-        <w:lastRenderedPageBreak/>
-        <w:t>Imobiliária Re/</w:t>
-      </w:r>
-      <w:proofErr w:type="spellStart"/>
-      <w:r>
-        <w:rPr>
-          <w:sz w:val="24"/>
-          <w:szCs w:val="24"/>
-        </w:rPr>
-        <w:t>max</w:t>
-      </w:r>
-      <w:proofErr w:type="spellEnd"/>
+        <w:t xml:space="preserve">Imobiliária </w:t>
+      </w:r>
+      <w:r>
+        <w:rPr>
+          <w:sz w:val="24"/>
+          <w:szCs w:val="24"/>
+        </w:rPr>
+        <w:t>Remax</w:t>
+      </w:r>
+      <w:bookmarkStart w:id="0" w:name="_GoBack"/>
+      <w:bookmarkEnd w:id="0"/>
       <w:r>
         <w:rPr>
           <w:sz w:val="24"/>
@@ -3307,6 +3597,7 @@
           <w:sz w:val="24"/>
           <w:szCs w:val="24"/>
         </w:rPr>
+        <w:lastRenderedPageBreak/>
         <w:t>_________________________________</w:t>
       </w:r>
     </w:p>

</xml_diff>

<commit_message>
Financeiro: adiciona botão Excluir no detalhe do lançamento
</commit_message>
<xml_diff>
--- a/templates/Contrato de gestão __Nome _ Razão Social__.docx
+++ b/templates/Contrato de gestão __Nome _ Razão Social__.docx
@@ -3408,6 +3408,42 @@
           <w:sz w:val="24"/>
           <w:szCs w:val="24"/>
         </w:rPr>
+        <w:t>_________________________________</w:t>
+      </w:r>
+    </w:p>
+    <w:p>
+      <w:pPr>
+        <w:spacing w:line="360" w:lineRule="auto"/>
+        <w:ind w:left="-566" w:right="-607"/>
+        <w:jc w:val="center"/>
+        <w:rPr>
+          <w:sz w:val="24"/>
+          <w:szCs w:val="24"/>
+        </w:rPr>
+      </w:pPr>
+      <w:r>
+        <w:rPr>
+          <w:sz w:val="24"/>
+          <w:szCs w:val="24"/>
+        </w:rPr>
+        <w:t>CONTRATANTE</w:t>
+      </w:r>
+    </w:p>
+    <w:p>
+      <w:pPr>
+        <w:spacing w:line="360" w:lineRule="auto"/>
+        <w:ind w:left="-566" w:right="-607"/>
+        <w:jc w:val="center"/>
+        <w:rPr>
+          <w:sz w:val="24"/>
+          <w:szCs w:val="24"/>
+        </w:rPr>
+      </w:pPr>
+      <w:r>
+        <w:rPr>
+          <w:sz w:val="24"/>
+          <w:szCs w:val="24"/>
+        </w:rPr>
         <w:t>{{</w:t>
       </w:r>
       <w:proofErr w:type="spellStart"/>
@@ -3416,7 +3452,7 @@
           <w:sz w:val="24"/>
           <w:szCs w:val="24"/>
         </w:rPr>
-        <w:t>AssinaturasAdicionais</w:t>
+        <w:t>NomeRazaoSocial</w:t>
       </w:r>
       <w:proofErr w:type="spellEnd"/>
       <w:r>
@@ -3426,6 +3462,30 @@
         </w:rPr>
         <w:t>}}</w:t>
       </w:r>
+      <w:r>
+        <w:rPr>
+          <w:sz w:val="24"/>
+          <w:szCs w:val="24"/>
+        </w:rPr>
+        <w:br/>
+        <w:t>{{</w:t>
+      </w:r>
+      <w:proofErr w:type="spellStart"/>
+      <w:r>
+        <w:rPr>
+          <w:sz w:val="24"/>
+          <w:szCs w:val="24"/>
+        </w:rPr>
+        <w:t>CpfCnpj</w:t>
+      </w:r>
+      <w:proofErr w:type="spellEnd"/>
+      <w:r>
+        <w:rPr>
+          <w:sz w:val="24"/>
+          <w:szCs w:val="24"/>
+        </w:rPr>
+        <w:t>}}</w:t>
+      </w:r>
     </w:p>
     <w:p>
       <w:pPr>
@@ -3437,113 +3497,137 @@
           <w:szCs w:val="24"/>
         </w:rPr>
       </w:pPr>
-    </w:p>
-    <w:p>
-      <w:pPr>
-        <w:spacing w:line="360" w:lineRule="auto"/>
-        <w:ind w:left="-566" w:right="-607"/>
-        <w:jc w:val="center"/>
-        <w:rPr>
-          <w:sz w:val="24"/>
-          <w:szCs w:val="24"/>
-        </w:rPr>
-      </w:pPr>
-    </w:p>
-    <w:p>
-      <w:pPr>
-        <w:spacing w:line="360" w:lineRule="auto"/>
-        <w:ind w:left="-566" w:right="-607"/>
-        <w:jc w:val="center"/>
-        <w:rPr>
-          <w:sz w:val="24"/>
-          <w:szCs w:val="24"/>
-        </w:rPr>
-      </w:pPr>
-    </w:p>
-    <w:p>
-      <w:pPr>
-        <w:spacing w:line="360" w:lineRule="auto"/>
-        <w:ind w:left="-566" w:right="-607"/>
-        <w:jc w:val="center"/>
-        <w:rPr>
-          <w:sz w:val="24"/>
-          <w:szCs w:val="24"/>
-        </w:rPr>
-      </w:pPr>
-    </w:p>
-    <w:p>
-      <w:pPr>
-        <w:spacing w:line="360" w:lineRule="auto"/>
-        <w:ind w:left="-566" w:right="-607"/>
-        <w:jc w:val="center"/>
-        <w:rPr>
-          <w:sz w:val="24"/>
-          <w:szCs w:val="24"/>
-        </w:rPr>
-      </w:pPr>
-    </w:p>
-    <w:p>
-      <w:pPr>
-        <w:spacing w:line="360" w:lineRule="auto"/>
-        <w:ind w:left="-566" w:right="-607"/>
-        <w:jc w:val="center"/>
-        <w:rPr>
-          <w:sz w:val="24"/>
-          <w:szCs w:val="24"/>
-        </w:rPr>
-      </w:pPr>
-      <w:r>
-        <w:rPr>
-          <w:sz w:val="24"/>
-          <w:szCs w:val="24"/>
-        </w:rPr>
-        <w:t>_________________________________</w:t>
-      </w:r>
-    </w:p>
-    <w:p>
-      <w:pPr>
-        <w:spacing w:line="360" w:lineRule="auto"/>
-        <w:ind w:left="-566" w:right="-607"/>
-        <w:jc w:val="center"/>
-        <w:rPr>
-          <w:sz w:val="24"/>
-          <w:szCs w:val="24"/>
-        </w:rPr>
-      </w:pPr>
-      <w:r>
-        <w:rPr>
-          <w:sz w:val="24"/>
-          <w:szCs w:val="24"/>
-        </w:rPr>
-        <w:t>CONTRATADA</w:t>
-      </w:r>
-    </w:p>
-    <w:p>
-      <w:pPr>
-        <w:spacing w:line="360" w:lineRule="auto"/>
-        <w:ind w:left="-566" w:right="-607"/>
-        <w:jc w:val="center"/>
-        <w:rPr>
-          <w:sz w:val="24"/>
-          <w:szCs w:val="24"/>
-        </w:rPr>
-      </w:pPr>
-      <w:r>
-        <w:rPr>
-          <w:sz w:val="24"/>
-          <w:szCs w:val="24"/>
-        </w:rPr>
-        <w:t xml:space="preserve">Imobiliária </w:t>
-      </w:r>
-      <w:r>
-        <w:rPr>
-          <w:sz w:val="24"/>
-          <w:szCs w:val="24"/>
-        </w:rPr>
-        <w:t>Remax</w:t>
-      </w:r>
       <w:bookmarkStart w:id="0" w:name="_GoBack"/>
       <w:bookmarkEnd w:id="0"/>
+    </w:p>
+    <w:p>
+      <w:pPr>
+        <w:spacing w:line="360" w:lineRule="auto"/>
+        <w:ind w:left="-566" w:right="-607"/>
+        <w:jc w:val="right"/>
+        <w:rPr>
+          <w:sz w:val="24"/>
+          <w:szCs w:val="24"/>
+        </w:rPr>
+      </w:pPr>
+    </w:p>
+    <w:p>
+      <w:pPr>
+        <w:spacing w:line="360" w:lineRule="auto"/>
+        <w:ind w:left="-566" w:right="-607"/>
+        <w:jc w:val="center"/>
+        <w:rPr>
+          <w:sz w:val="24"/>
+          <w:szCs w:val="24"/>
+        </w:rPr>
+      </w:pPr>
+      <w:r>
+        <w:rPr>
+          <w:sz w:val="24"/>
+          <w:szCs w:val="24"/>
+        </w:rPr>
+        <w:t>{{</w:t>
+      </w:r>
+      <w:proofErr w:type="spellStart"/>
+      <w:r>
+        <w:rPr>
+          <w:sz w:val="24"/>
+          <w:szCs w:val="24"/>
+        </w:rPr>
+        <w:t>AssinaturasAdicionais</w:t>
+      </w:r>
+      <w:proofErr w:type="spellEnd"/>
+      <w:r>
+        <w:rPr>
+          <w:sz w:val="24"/>
+          <w:szCs w:val="24"/>
+        </w:rPr>
+        <w:t>}}</w:t>
+      </w:r>
+    </w:p>
+    <w:p>
+      <w:pPr>
+        <w:spacing w:line="360" w:lineRule="auto"/>
+        <w:ind w:left="-566" w:right="-607"/>
+        <w:jc w:val="center"/>
+        <w:rPr>
+          <w:sz w:val="24"/>
+          <w:szCs w:val="24"/>
+        </w:rPr>
+      </w:pPr>
+    </w:p>
+    <w:p>
+      <w:pPr>
+        <w:spacing w:line="360" w:lineRule="auto"/>
+        <w:ind w:left="-566" w:right="-607"/>
+        <w:jc w:val="center"/>
+        <w:rPr>
+          <w:sz w:val="24"/>
+          <w:szCs w:val="24"/>
+        </w:rPr>
+      </w:pPr>
+    </w:p>
+    <w:p>
+      <w:pPr>
+        <w:spacing w:line="360" w:lineRule="auto"/>
+        <w:ind w:left="-566" w:right="-607"/>
+        <w:jc w:val="center"/>
+        <w:rPr>
+          <w:sz w:val="24"/>
+          <w:szCs w:val="24"/>
+        </w:rPr>
+      </w:pPr>
+      <w:r>
+        <w:rPr>
+          <w:sz w:val="24"/>
+          <w:szCs w:val="24"/>
+        </w:rPr>
+        <w:t>_________________________________</w:t>
+      </w:r>
+    </w:p>
+    <w:p>
+      <w:pPr>
+        <w:spacing w:line="360" w:lineRule="auto"/>
+        <w:ind w:left="-566" w:right="-607"/>
+        <w:jc w:val="center"/>
+        <w:rPr>
+          <w:sz w:val="24"/>
+          <w:szCs w:val="24"/>
+        </w:rPr>
+      </w:pPr>
+      <w:r>
+        <w:rPr>
+          <w:sz w:val="24"/>
+          <w:szCs w:val="24"/>
+        </w:rPr>
+        <w:t>CONTRATADA</w:t>
+      </w:r>
+    </w:p>
+    <w:p>
+      <w:pPr>
+        <w:spacing w:line="360" w:lineRule="auto"/>
+        <w:ind w:left="-566" w:right="-607"/>
+        <w:jc w:val="center"/>
+        <w:rPr>
+          <w:sz w:val="24"/>
+          <w:szCs w:val="24"/>
+        </w:rPr>
+      </w:pPr>
+      <w:r>
+        <w:rPr>
+          <w:sz w:val="24"/>
+          <w:szCs w:val="24"/>
+        </w:rPr>
+        <w:lastRenderedPageBreak/>
+        <w:t xml:space="preserve">Imobiliária </w:t>
+      </w:r>
+      <w:r>
+        <w:rPr>
+          <w:sz w:val="24"/>
+          <w:szCs w:val="24"/>
+        </w:rPr>
+        <w:t>Remax</w:t>
+      </w:r>
       <w:r>
         <w:rPr>
           <w:sz w:val="24"/>
@@ -3597,7 +3681,6 @@
           <w:sz w:val="24"/>
           <w:szCs w:val="24"/>
         </w:rPr>
-        <w:lastRenderedPageBreak/>
         <w:t>_________________________________</w:t>
       </w:r>
     </w:p>
@@ -4799,6 +4882,7 @@
   <w:style w:type="paragraph" w:default="1" w:styleId="Normal">
     <w:name w:val="Normal"/>
     <w:qFormat/>
+    <w:rsid w:val="00970B49"/>
   </w:style>
   <w:style w:type="paragraph" w:styleId="Ttulo1">
     <w:name w:val="heading 1"/>

</xml_diff>